<commit_message>
Revisando detalles de el informe
</commit_message>
<xml_diff>
--- a/documentacion/2026-2_ISC-Informe_Proyecto_Final_BASAV_GRUPAL 1.docx
+++ b/documentacion/2026-2_ISC-Informe_Proyecto_Final_BASAV_GRUPAL 1.docx
@@ -13259,6 +13259,7 @@
               <w:rPr>
                 <w:rFonts w:ascii="Times New Roman" w:hAnsi="Times New Roman" w:cs="Times New Roman"/>
               </w:rPr>
+              <w:lastRenderedPageBreak/>
               <w:t>4. Carga de hechos</w:t>
             </w:r>
           </w:p>
@@ -14777,9 +14778,15 @@
     <w:p>
       <w:pPr>
         <w:pStyle w:val="Estilo2APA"/>
+        <w:rPr>
+          <w:lang w:val="es-PE"/>
+        </w:rPr>
       </w:pPr>
       <w:bookmarkStart w:id="23" w:name="_Toc243500553"/>
       <w:r>
+        <w:rPr>
+          <w:lang w:val="es-PE"/>
+        </w:rPr>
         <w:t>3.5 Diseño de la solución Big Data</w:t>
       </w:r>
       <w:bookmarkEnd w:id="23"/>
@@ -14808,9 +14815,15 @@
     <w:p>
       <w:pPr>
         <w:pStyle w:val="Estilo2APA"/>
+        <w:rPr>
+          <w:lang w:val="es-PE"/>
+        </w:rPr>
       </w:pPr>
       <w:bookmarkStart w:id="24" w:name="_Toc243500554"/>
       <w:r>
+        <w:rPr>
+          <w:lang w:val="es-PE"/>
+        </w:rPr>
         <w:t>3.5.1 Justificación y requisitos Big Data</w:t>
       </w:r>
       <w:bookmarkEnd w:id="24"/>
@@ -14837,9 +14850,15 @@
     <w:p>
       <w:pPr>
         <w:pStyle w:val="Estilo2APA"/>
+        <w:rPr>
+          <w:lang w:val="es-PE"/>
+        </w:rPr>
       </w:pPr>
       <w:bookmarkStart w:id="25" w:name="_Toc243500555"/>
       <w:r>
+        <w:rPr>
+          <w:lang w:val="es-PE"/>
+        </w:rPr>
         <w:t>3.5.2 Arquitectura y componentes</w:t>
       </w:r>
       <w:bookmarkEnd w:id="25"/>
@@ -14866,9 +14885,15 @@
     <w:p>
       <w:pPr>
         <w:pStyle w:val="Estilo2APA"/>
+        <w:rPr>
+          <w:lang w:val="es-PE"/>
+        </w:rPr>
       </w:pPr>
       <w:bookmarkStart w:id="26" w:name="_Toc243500556"/>
       <w:r>
+        <w:rPr>
+          <w:lang w:val="es-PE"/>
+        </w:rPr>
         <w:t>3.5.3 Modelo y ciclo de vida de datos</w:t>
       </w:r>
       <w:bookmarkEnd w:id="26"/>
@@ -14895,9 +14920,15 @@
     <w:p>
       <w:pPr>
         <w:pStyle w:val="Estilo2APA"/>
+        <w:rPr>
+          <w:lang w:val="es-PE"/>
+        </w:rPr>
       </w:pPr>
       <w:bookmarkStart w:id="27" w:name="_Toc243500557"/>
       <w:r>
+        <w:rPr>
+          <w:lang w:val="es-PE"/>
+        </w:rPr>
         <w:t>3.5.4 Escalabilidad, resiliencia y operación</w:t>
       </w:r>
       <w:bookmarkEnd w:id="27"/>
@@ -14927,13 +14958,22 @@
     <w:p>
       <w:pPr>
         <w:pStyle w:val="Estilo2APA"/>
+        <w:rPr>
+          <w:lang w:val="es-PE"/>
+        </w:rPr>
       </w:pPr>
       <w:bookmarkStart w:id="28" w:name="_Toc243500558"/>
       <w:r>
+        <w:rPr>
+          <w:lang w:val="es-PE"/>
+        </w:rPr>
         <w:t>3.5.5 Resultados</w:t>
       </w:r>
       <w:bookmarkEnd w:id="28"/>
       <w:r>
+        <w:rPr>
+          <w:lang w:val="es-PE"/>
+        </w:rPr>
         <w:t xml:space="preserve"> </w:t>
       </w:r>
     </w:p>
@@ -15666,6 +15706,7 @@
           <w:i/>
           <w:iCs/>
         </w:rPr>
+        <w:lastRenderedPageBreak/>
         <w:t>Tabla</w:t>
       </w:r>
       <w:proofErr w:type="spellEnd"/>
@@ -16313,9 +16354,15 @@
     <w:p>
       <w:pPr>
         <w:pStyle w:val="Titulo1APA"/>
+        <w:rPr>
+          <w:lang w:val="es-PE"/>
+        </w:rPr>
       </w:pPr>
       <w:bookmarkStart w:id="31" w:name="_Toc243500561"/>
       <w:r>
+        <w:rPr>
+          <w:lang w:val="es-PE"/>
+        </w:rPr>
         <w:t>CAPÍTULO IV: DISEÑO DEL EXPERIMENTO</w:t>
       </w:r>
       <w:bookmarkEnd w:id="31"/>
@@ -26997,9 +27044,15 @@
     <w:p>
       <w:pPr>
         <w:pStyle w:val="Estilo2APA"/>
+        <w:rPr>
+          <w:lang w:val="es-PE"/>
+        </w:rPr>
       </w:pPr>
       <w:bookmarkStart w:id="52" w:name="_Toc243500582"/>
       <w:r>
+        <w:rPr>
+          <w:lang w:val="es-PE"/>
+        </w:rPr>
         <w:t>6.5 Análisis e interpretación técnica</w:t>
       </w:r>
       <w:bookmarkEnd w:id="52"/>
@@ -27017,9 +27070,45 @@
       </w:pPr>
       <w:r>
         <w:rPr>
-          <w:lang w:val="es-PE"/>
-        </w:rPr>
-        <w:t>Contraste cada resultado con el objetivo, la hipótesis o el resultado esperado.</w:t>
+          <w:b/>
+          <w:lang w:val="es-PE"/>
+        </w:rPr>
+        <w:t xml:space="preserve">Contraste con las metas. </w:t>
+      </w:r>
+      <w:r>
+        <w:rPr>
+          <w:lang w:val="es-PE"/>
+        </w:rPr>
+        <w:t xml:space="preserve">De los diez KPI definidos en la Tabla 3.4, algunos resultados ya alcanzan la meta propuesta y otros aún no. La Tasa de Cancelación (K5) se ubica en 16,12%, por encima de la meta de 14% o menos. La Tasa de Recompra (K8) alcanza 69,98%, cerca de la meta de 72% pero sin llegar a cumplirla. La concentración de ingresos en Reino Unido (K9) es de 84,6%, por encima de la meta de reducirla a 80%. La Tasa de Riesgo de Abandono (K10) es de 33,40%, con una brecha considerable respecto a la meta de 25%. En el proceso ETL, el tiempo de consulta OLAP bajó de 52,5 ms sin índices a 40,0 ms con tres índices no </w:t>
+      </w:r>
+      <w:proofErr w:type="spellStart"/>
+      <w:r>
+        <w:rPr>
+          <w:lang w:val="es-PE"/>
+        </w:rPr>
+        <w:t>clusterizados</w:t>
+      </w:r>
+      <w:proofErr w:type="spellEnd"/>
+      <w:r>
+        <w:rPr>
+          <w:lang w:val="es-PE"/>
+        </w:rPr>
+        <w:t xml:space="preserve"> (EXP-01, 6.3), una mejora cercana al 24%, y la carga del ETL concilió el 100% de las 541.909 filas del </w:t>
+      </w:r>
+      <w:proofErr w:type="spellStart"/>
+      <w:r>
+        <w:rPr>
+          <w:lang w:val="es-PE"/>
+        </w:rPr>
+        <w:lastRenderedPageBreak/>
+        <w:t>dataset</w:t>
+      </w:r>
+      <w:proofErr w:type="spellEnd"/>
+      <w:r>
+        <w:rPr>
+          <w:lang w:val="es-PE"/>
+        </w:rPr>
+        <w:t xml:space="preserve"> en 4 segundos de ejecución oficial, cumpliendo el objetivo de integridad planteado para el experimento (RNF-01, RNF-04).</w:t>
       </w:r>
     </w:p>
     <w:p>
@@ -27035,9 +27124,58 @@
       </w:pPr>
       <w:r>
         <w:rPr>
-          <w:lang w:val="es-PE"/>
-        </w:rPr>
-        <w:t>Compare los escenarios y explique diferencias de rendimiento, escalabilidad, calidad o valor para el negocio.</w:t>
+          <w:b/>
+          <w:lang w:val="es-PE"/>
+        </w:rPr>
+        <w:t xml:space="preserve">Comparación de escenarios. </w:t>
+      </w:r>
+      <w:r>
+        <w:rPr>
+          <w:lang w:val="es-PE"/>
+        </w:rPr>
+        <w:t xml:space="preserve">El único escenario con resultados completos hasta el momento es EXP-01 (BI, consulta sin índices frente a consulta con tres índices no </w:t>
+      </w:r>
+      <w:proofErr w:type="spellStart"/>
+      <w:r>
+        <w:rPr>
+          <w:lang w:val="es-PE"/>
+        </w:rPr>
+        <w:t>clusterizados</w:t>
+      </w:r>
+      <w:proofErr w:type="spellEnd"/>
+      <w:r>
+        <w:rPr>
+          <w:lang w:val="es-PE"/>
+        </w:rPr>
+        <w:t xml:space="preserve"> sobre las llaves foráneas de </w:t>
+      </w:r>
+      <w:proofErr w:type="spellStart"/>
+      <w:r>
+        <w:rPr>
+          <w:lang w:val="es-PE"/>
+        </w:rPr>
+        <w:t>fac_ventas</w:t>
+      </w:r>
+      <w:proofErr w:type="spellEnd"/>
+      <w:r>
+        <w:rPr>
+          <w:lang w:val="es-PE"/>
+        </w:rPr>
+        <w:t xml:space="preserve">): agregar los índices redujo la latencia de 52,5 ms a 40,0 ms y el tiempo de espera en el servidor de 44,0 ms a 31,6 ms, una mejora de rendimiento medible pero moderada, esperable dado que la consulta de prueba agrega solo 302 filas. Los escenarios de Big Data (EXP-02) y el comparativo entre ambas soluciones (EXP-03) todavía están pendientes de ejecutar (ver 3.5), por lo que, por ahora, la comparación de rendimiento y escalabilidad queda limitada a la solución de Business </w:t>
+      </w:r>
+      <w:proofErr w:type="spellStart"/>
+      <w:r>
+        <w:rPr>
+          <w:lang w:val="es-PE"/>
+        </w:rPr>
+        <w:t>Intelligence</w:t>
+      </w:r>
+      <w:proofErr w:type="spellEnd"/>
+      <w:r>
+        <w:rPr>
+          <w:lang w:val="es-PE"/>
+        </w:rPr>
+        <w:t>.</w:t>
       </w:r>
     </w:p>
     <w:p>
@@ -27053,9 +27191,16 @@
       </w:pPr>
       <w:r>
         <w:rPr>
-          <w:lang w:val="es-PE"/>
-        </w:rPr>
-        <w:t>Identifique patrones, errores, cuellos de botella, anomalías y limitaciones con evidencia cuantitativa.</w:t>
+          <w:b/>
+          <w:lang w:val="es-PE"/>
+        </w:rPr>
+        <w:t xml:space="preserve">Patrones, errores y limitaciones. </w:t>
+      </w:r>
+      <w:r>
+        <w:rPr>
+          <w:lang w:val="es-PE"/>
+        </w:rPr>
+        <w:t>El registro de ejecuciones del ETL documenta dos intentos fallidos antes de la carga exitosa: el primero por comas internas en la descripción de producto que desplazaban columnas durante el BULK INSERT con delimitador de coma, y el segundo por fechas almacenadas como número de serie de Excel en la columna fechaFactura. El perfilado de calidad (Tabla 3.9 y 3.10) identificó 135.080 filas sin cliente identificado, que se conservaron como cliente “desconocido” en vez de descartarse, 9.288 filas de cancelación separadas por tipo de transacción, y 2.517 filas con precio unitario menor o igual a cero, que sí se excluyeron de la tabla de hechos. En cuanto a patrones de negocio, la concentración del 84,6% de los ingresos en un solo país (Reino Unido) constituye un riesgo de mercado que el propio dashboard expone en la página Productos y mercados.</w:t>
       </w:r>
     </w:p>
     <w:p>
@@ -27071,9 +27216,17 @@
       </w:pPr>
       <w:r>
         <w:rPr>
-          <w:lang w:val="es-PE"/>
-        </w:rPr>
-        <w:t>Explique los compromisos de ingeniería entre precisión, latencia, costo, complejidad, seguridad y mantenibilidad.</w:t>
+          <w:b/>
+          <w:lang w:val="es-PE"/>
+        </w:rPr>
+        <w:lastRenderedPageBreak/>
+        <w:t xml:space="preserve">Compromisos de ingeniería. </w:t>
+      </w:r>
+      <w:r>
+        <w:rPr>
+          <w:lang w:val="es-PE"/>
+        </w:rPr>
+        <w:t>Conservar las filas sin cliente identificado como “desconocido”, en vez de descartarlas, prioriza la completitud de los ingresos totales por encima de la precisión del análisis a nivel de cliente individual. Incorporar los tres índices no clusterizados mejora la latencia de consulta, pero añade un costo de almacenamiento y de mantenimiento en cada ejecución del ETL. El tratamiento tipo 1 (sobrescritura) aplicado a las dimensiones de cliente, producto y país simplifica el modelo dimensional, a cambio de no conservar el historial de cambios de esos atributos. Por último, las metas de los diez KPI están definidas como valores fijos dentro de las medidas DAX del dashboard, una solución simple de implementar en el tiempo del proyecto, pero menos mantenible si esas metas cambian en el futuro (ver recomendación R1, 7.3).</w:t>
       </w:r>
     </w:p>
     <w:p>
@@ -27089,17 +27242,46 @@
       </w:pPr>
       <w:r>
         <w:rPr>
-          <w:lang w:val="es-PE"/>
-        </w:rPr>
-        <w:t>Diferencie correlación, causalidad e inferencias que el experimento no permite sostener.</w:t>
+          <w:b/>
+          <w:lang w:val="es-PE"/>
+        </w:rPr>
+        <w:t xml:space="preserve">Límites de la inferencia. </w:t>
+      </w:r>
+      <w:r>
+        <w:rPr>
+          <w:lang w:val="es-PE"/>
+        </w:rPr>
+        <w:t>La mejora de latencia observada al incorporar índices no permite afirmar una relación causal generalizable, dado que se midió sobre una sola consulta de prueba (302 filas agregadas) y un número reducido de corridas (entre 5 y 6), sin un diseño estadístico que aísle otras variables del servidor. Tampoco puede sostenerse que un cliente con recencia mayor a 90 días vaya a abandonar la relación comercial: ese umbral es una regla de negocio definida por el equipo para priorizar campañas de retención (K10), no una predicción validada con un modelo de abandono. Finalmente, todos los resultados corresponden a una sola empresa minorista del Reino Unido durante un periodo acotado (diciembre de 2010 a diciembre de 2011), por lo que no deben generalizarse a otro negocio, mercado o periodo sin repetir el análisis sobre datos propios.</w:t>
       </w:r>
     </w:p>
     <w:p>
       <w:pPr>
+        <w:pStyle w:val="NormalAPA"/>
+        <w:rPr>
+          <w:lang w:val="es-PE"/>
+        </w:rPr>
+      </w:pPr>
+    </w:p>
+    <w:p>
+      <w:pPr>
+        <w:pStyle w:val="NormalAPA"/>
+        <w:rPr>
+          <w:lang w:val="es-PE"/>
+        </w:rPr>
+      </w:pPr>
+    </w:p>
+    <w:p>
+      <w:pPr>
         <w:pStyle w:val="Estilo2APA"/>
+        <w:rPr>
+          <w:lang w:val="es-PE"/>
+        </w:rPr>
       </w:pPr>
       <w:bookmarkStart w:id="53" w:name="_Toc243500583"/>
       <w:r>
+        <w:rPr>
+          <w:lang w:val="es-PE"/>
+        </w:rPr>
         <w:lastRenderedPageBreak/>
         <w:t>6.6 Verificación de funcionalidad y completitud</w:t>
       </w:r>
@@ -29026,15 +29208,9 @@
     <w:p>
       <w:pPr>
         <w:pStyle w:val="Titulo1APA"/>
-        <w:rPr>
-          <w:lang w:val="es-PE"/>
-        </w:rPr>
       </w:pPr>
       <w:bookmarkStart w:id="62" w:name="_Toc243500592"/>
       <w:r>
-        <w:rPr>
-          <w:lang w:val="es-PE"/>
-        </w:rPr>
         <w:t>REFERENCIAS BIBLIOGRÁFICAS</w:t>
       </w:r>
       <w:bookmarkEnd w:id="62"/>
@@ -32273,14 +32449,7 @@
           <w:rStyle w:val="NormalAPACar"/>
           <w:lang w:val="es-PE"/>
         </w:rPr>
-        <w:t xml:space="preserve">de  </w:t>
-      </w:r>
-      <w:r>
-        <w:rPr>
-          <w:rStyle w:val="NormalAPACar"/>
-          <w:lang w:val="es-PE"/>
-        </w:rPr>
-        <w:t>Declaración</w:t>
+        <w:t>de  Declaración</w:t>
       </w:r>
       <w:proofErr w:type="gramEnd"/>
       <w:r>
@@ -37898,6 +38067,30 @@
 </file>
 
 <file path=customXml/item1.xml><?xml version="1.0" encoding="utf-8"?>
+<?mso-contentType ?>
+<FormTemplates xmlns="http://schemas.microsoft.com/sharepoint/v3/contenttype/forms">
+  <Display>DocumentLibraryForm</Display>
+  <Edit>DocumentLibraryForm</Edit>
+  <New>DocumentLibraryForm</New>
+</FormTemplates>
+</file>
+
+<file path=customXml/item2.xml><?xml version="1.0" encoding="utf-8"?>
+<p:properties xmlns:p="http://schemas.microsoft.com/office/2006/metadata/properties" xmlns:xsi="http://www.w3.org/2001/XMLSchema-instance" xmlns:pc="http://schemas.microsoft.com/office/infopath/2007/PartnerControls">
+  <documentManagement>
+    <TaxCatchAll xmlns="2614824b-a320-4373-85ea-73b3da18f163" xsi:nil="true"/>
+    <lcf76f155ced4ddcb4097134ff3c332f xmlns="79ea598a-8a7a-4bdd-a4c2-f177b5709440">
+      <Terms xmlns="http://schemas.microsoft.com/office/infopath/2007/PartnerControls"/>
+    </lcf76f155ced4ddcb4097134ff3c332f>
+  </documentManagement>
+</p:properties>
+</file>
+
+<file path=customXml/item3.xml><?xml version="1.0" encoding="utf-8"?>
+<b:Sources xmlns:b="http://schemas.openxmlformats.org/officeDocument/2006/bibliography" xmlns="http://schemas.openxmlformats.org/officeDocument/2006/bibliography" SelectedStyle="\APASixthEditionOfficeOnline.xsl" StyleName="APA" Version="6"/>
+</file>
+
+<file path=customXml/item4.xml><?xml version="1.0" encoding="utf-8"?>
 <ct:contentTypeSchema xmlns:ct="http://schemas.microsoft.com/office/2006/metadata/contentType" xmlns:ma="http://schemas.microsoft.com/office/2006/metadata/properties/metaAttributes" ct:_="" ma:_="" ma:contentTypeName="Documento" ma:contentTypeID="0x010100B61F8F196ED39C4CA2716856819011E9" ma:contentTypeVersion="11" ma:contentTypeDescription="Crear nuevo documento." ma:contentTypeScope="" ma:versionID="cbd9c1cfa447b1b908507f236217bcc0">
   <xsd:schema xmlns:xsd="http://www.w3.org/2001/XMLSchema" xmlns:xs="http://www.w3.org/2001/XMLSchema" xmlns:p="http://schemas.microsoft.com/office/2006/metadata/properties" xmlns:ns2="79ea598a-8a7a-4bdd-a4c2-f177b5709440" xmlns:ns3="2614824b-a320-4373-85ea-73b3da18f163" targetNamespace="http://schemas.microsoft.com/office/2006/metadata/properties" ma:root="true" ma:fieldsID="0c54825fc1bf2a1a004d0d3ba670269f" ns2:_="" ns3:_="">
     <xsd:import namespace="79ea598a-8a7a-4bdd-a4c2-f177b5709440"/>
@@ -38092,31 +38285,34 @@
 </ct:contentTypeSchema>
 </file>
 
-<file path=customXml/item2.xml><?xml version="1.0" encoding="utf-8"?>
-<b:Sources xmlns:b="http://schemas.openxmlformats.org/officeDocument/2006/bibliography" xmlns="http://schemas.openxmlformats.org/officeDocument/2006/bibliography" SelectedStyle="\APASixthEditionOfficeOnline.xsl" StyleName="APA" Version="6"/>
+<file path=customXml/itemProps1.xml><?xml version="1.0" encoding="utf-8"?>
+<ds:datastoreItem xmlns:ds="http://schemas.openxmlformats.org/officeDocument/2006/customXml" ds:itemID="{5462FC43-E482-4149-907F-0D65F1C4AC3A}">
+  <ds:schemaRefs>
+    <ds:schemaRef ds:uri="http://schemas.microsoft.com/sharepoint/v3/contenttype/forms"/>
+  </ds:schemaRefs>
+</ds:datastoreItem>
 </file>
 
-<file path=customXml/item3.xml><?xml version="1.0" encoding="utf-8"?>
-<p:properties xmlns:p="http://schemas.microsoft.com/office/2006/metadata/properties" xmlns:xsi="http://www.w3.org/2001/XMLSchema-instance" xmlns:pc="http://schemas.microsoft.com/office/infopath/2007/PartnerControls">
-  <documentManagement>
-    <TaxCatchAll xmlns="2614824b-a320-4373-85ea-73b3da18f163" xsi:nil="true"/>
-    <lcf76f155ced4ddcb4097134ff3c332f xmlns="79ea598a-8a7a-4bdd-a4c2-f177b5709440">
-      <Terms xmlns="http://schemas.microsoft.com/office/infopath/2007/PartnerControls"/>
-    </lcf76f155ced4ddcb4097134ff3c332f>
-  </documentManagement>
-</p:properties>
+<file path=customXml/itemProps2.xml><?xml version="1.0" encoding="utf-8"?>
+<ds:datastoreItem xmlns:ds="http://schemas.openxmlformats.org/officeDocument/2006/customXml" ds:itemID="{19815EC6-D65E-4027-823B-7339BEB66178}">
+  <ds:schemaRefs>
+    <ds:schemaRef ds:uri="http://schemas.microsoft.com/office/2006/metadata/properties"/>
+    <ds:schemaRef ds:uri="http://schemas.microsoft.com/office/infopath/2007/PartnerControls"/>
+    <ds:schemaRef ds:uri="2614824b-a320-4373-85ea-73b3da18f163"/>
+    <ds:schemaRef ds:uri="79ea598a-8a7a-4bdd-a4c2-f177b5709440"/>
+  </ds:schemaRefs>
+</ds:datastoreItem>
 </file>
 
-<file path=customXml/item4.xml><?xml version="1.0" encoding="utf-8"?>
-<?mso-contentType ?>
-<FormTemplates xmlns="http://schemas.microsoft.com/sharepoint/v3/contenttype/forms">
-  <Display>DocumentLibraryForm</Display>
-  <Edit>DocumentLibraryForm</Edit>
-  <New>DocumentLibraryForm</New>
-</FormTemplates>
+<file path=customXml/itemProps3.xml><?xml version="1.0" encoding="utf-8"?>
+<ds:datastoreItem xmlns:ds="http://schemas.openxmlformats.org/officeDocument/2006/customXml" ds:itemID="{6E29EC09-DF90-4CBC-98BE-5BB5D23D9420}">
+  <ds:schemaRefs>
+    <ds:schemaRef ds:uri="http://schemas.openxmlformats.org/officeDocument/2006/bibliography"/>
+  </ds:schemaRefs>
+</ds:datastoreItem>
 </file>
 
-<file path=customXml/itemProps1.xml><?xml version="1.0" encoding="utf-8"?>
+<file path=customXml/itemProps4.xml><?xml version="1.0" encoding="utf-8"?>
 <ds:datastoreItem xmlns:ds="http://schemas.openxmlformats.org/officeDocument/2006/customXml" ds:itemID="{2C0365A0-1391-4E28-9C98-99548E09DB04}">
   <ds:schemaRefs>
     <ds:schemaRef ds:uri="http://schemas.microsoft.com/office/2006/metadata/contentType"/>
@@ -38133,31 +38329,4 @@
     <ds:schemaRef ds:uri="http://schemas.microsoft.com/internal/obd"/>
   </ds:schemaRefs>
 </ds:datastoreItem>
-</file>
-
-<file path=customXml/itemProps2.xml><?xml version="1.0" encoding="utf-8"?>
-<ds:datastoreItem xmlns:ds="http://schemas.openxmlformats.org/officeDocument/2006/customXml" ds:itemID="{6E29EC09-DF90-4CBC-98BE-5BB5D23D9420}">
-  <ds:schemaRefs>
-    <ds:schemaRef ds:uri="http://schemas.openxmlformats.org/officeDocument/2006/bibliography"/>
-  </ds:schemaRefs>
-</ds:datastoreItem>
-</file>
-
-<file path=customXml/itemProps3.xml><?xml version="1.0" encoding="utf-8"?>
-<ds:datastoreItem xmlns:ds="http://schemas.openxmlformats.org/officeDocument/2006/customXml" ds:itemID="{19815EC6-D65E-4027-823B-7339BEB66178}">
-  <ds:schemaRefs>
-    <ds:schemaRef ds:uri="http://schemas.microsoft.com/office/2006/metadata/properties"/>
-    <ds:schemaRef ds:uri="http://schemas.microsoft.com/office/infopath/2007/PartnerControls"/>
-    <ds:schemaRef ds:uri="2614824b-a320-4373-85ea-73b3da18f163"/>
-    <ds:schemaRef ds:uri="79ea598a-8a7a-4bdd-a4c2-f177b5709440"/>
-  </ds:schemaRefs>
-</ds:datastoreItem>
-</file>
-
-<file path=customXml/itemProps4.xml><?xml version="1.0" encoding="utf-8"?>
-<ds:datastoreItem xmlns:ds="http://schemas.openxmlformats.org/officeDocument/2006/customXml" ds:itemID="{5462FC43-E482-4149-907F-0D65F1C4AC3A}">
-  <ds:schemaRefs>
-    <ds:schemaRef ds:uri="http://schemas.microsoft.com/sharepoint/v3/contenttype/forms"/>
-  </ds:schemaRefs>
-</ds:datastoreItem>
 </file>
</xml_diff>

<commit_message>
todos los documentos completos
</commit_message>
<xml_diff>
--- a/documentacion/2026-2_ISC-Informe_Proyecto_Final_BASAV_GRUPAL 1.docx
+++ b/documentacion/2026-2_ISC-Informe_Proyecto_Final_BASAV_GRUPAL 1.docx
@@ -867,15 +867,6 @@
     </w:p>
     <w:p>
       <w:r>
-        <w:br w:type="page"/>
-      </w:r>
-    </w:p>
-    <w:p>
-      <w:pPr>
-        <w:pStyle w:val="Titulo1"/>
-      </w:pPr>
-      <w:r>
-        <w:lastRenderedPageBreak/>
         <w:t>ÍNDICE</w:t>
       </w:r>
       <w:r>
@@ -918,7 +909,7 @@
               <w:rFonts w:ascii="Times New Roman" w:hAnsi="Times New Roman" w:cs="Times New Roman"/>
               <w:lang w:val="es-MX"/>
             </w:rPr>
-            <w:t>Tabla de contenido</w:t>
+            <w:t>INDICE</w:t>
           </w:r>
         </w:p>
         <w:p>
@@ -950,7 +941,7 @@
             </w:rPr>
             <w:fldChar w:fldCharType="separate"/>
           </w:r>
-          <w:hyperlink w:anchor="_Toc243500530" w:history="1">
+          <w:hyperlink w:anchor="_Toc243515234" w:history="1">
             <w:r>
               <w:rPr>
                 <w:rStyle w:val="Hipervnculo"/>
@@ -978,7 +969,7 @@
                 <w:noProof/>
                 <w:webHidden/>
               </w:rPr>
-              <w:instrText xml:space="preserve"> PAGEREF _Toc243500530 \h </w:instrText>
+              <w:instrText xml:space="preserve"> PAGEREF _Toc243515234 \h </w:instrText>
             </w:r>
             <w:r>
               <w:rPr>
@@ -998,7 +989,7 @@
                 <w:noProof/>
                 <w:webHidden/>
               </w:rPr>
-              <w:t>5</w:t>
+              <w:t>4</w:t>
             </w:r>
             <w:r>
               <w:rPr>
@@ -1020,7 +1011,7 @@
               <w:lang w:val="es-PE" w:eastAsia="es-PE"/>
             </w:rPr>
           </w:pPr>
-          <w:hyperlink w:anchor="_Toc243500531" w:history="1">
+          <w:hyperlink w:anchor="_Toc243515235" w:history="1">
             <w:r>
               <w:rPr>
                 <w:rStyle w:val="Hipervnculo"/>
@@ -1048,7 +1039,7 @@
                 <w:noProof/>
                 <w:webHidden/>
               </w:rPr>
-              <w:instrText xml:space="preserve"> PAGEREF _Toc243500531 \h </w:instrText>
+              <w:instrText xml:space="preserve"> PAGEREF _Toc243515235 \h </w:instrText>
             </w:r>
             <w:r>
               <w:rPr>
@@ -1068,7 +1059,7 @@
                 <w:noProof/>
                 <w:webHidden/>
               </w:rPr>
-              <w:t>6</w:t>
+              <w:t>5</w:t>
             </w:r>
             <w:r>
               <w:rPr>
@@ -1090,7 +1081,7 @@
               <w:lang w:val="es-PE" w:eastAsia="es-PE"/>
             </w:rPr>
           </w:pPr>
-          <w:hyperlink w:anchor="_Toc243500532" w:history="1">
+          <w:hyperlink w:anchor="_Toc243515236" w:history="1">
             <w:r>
               <w:rPr>
                 <w:rStyle w:val="Hipervnculo"/>
@@ -1118,7 +1109,7 @@
                 <w:noProof/>
                 <w:webHidden/>
               </w:rPr>
-              <w:instrText xml:space="preserve"> PAGEREF _Toc243500532 \h </w:instrText>
+              <w:instrText xml:space="preserve"> PAGEREF _Toc243515236 \h </w:instrText>
             </w:r>
             <w:r>
               <w:rPr>
@@ -1138,7 +1129,7 @@
                 <w:noProof/>
                 <w:webHidden/>
               </w:rPr>
-              <w:t>7</w:t>
+              <w:t>6</w:t>
             </w:r>
             <w:r>
               <w:rPr>
@@ -1163,7 +1154,7 @@
               <w:lang w:val="es-PE" w:eastAsia="es-PE"/>
             </w:rPr>
           </w:pPr>
-          <w:hyperlink w:anchor="_Toc243500533" w:history="1">
+          <w:hyperlink w:anchor="_Toc243515237" w:history="1">
             <w:r>
               <w:rPr>
                 <w:rStyle w:val="Hipervnculo"/>
@@ -1191,7 +1182,7 @@
                 <w:noProof/>
                 <w:webHidden/>
               </w:rPr>
-              <w:instrText xml:space="preserve"> PAGEREF _Toc243500533 \h </w:instrText>
+              <w:instrText xml:space="preserve"> PAGEREF _Toc243515237 \h </w:instrText>
             </w:r>
             <w:r>
               <w:rPr>
@@ -1211,7 +1202,7 @@
                 <w:noProof/>
                 <w:webHidden/>
               </w:rPr>
-              <w:t>7</w:t>
+              <w:t>6</w:t>
             </w:r>
             <w:r>
               <w:rPr>
@@ -1236,7 +1227,7 @@
               <w:lang w:val="es-PE" w:eastAsia="es-PE"/>
             </w:rPr>
           </w:pPr>
-          <w:hyperlink w:anchor="_Toc243500534" w:history="1">
+          <w:hyperlink w:anchor="_Toc243515238" w:history="1">
             <w:r>
               <w:rPr>
                 <w:rStyle w:val="Hipervnculo"/>
@@ -1264,7 +1255,7 @@
                 <w:noProof/>
                 <w:webHidden/>
               </w:rPr>
-              <w:instrText xml:space="preserve"> PAGEREF _Toc243500534 \h </w:instrText>
+              <w:instrText xml:space="preserve"> PAGEREF _Toc243515238 \h </w:instrText>
             </w:r>
             <w:r>
               <w:rPr>
@@ -1284,7 +1275,7 @@
                 <w:noProof/>
                 <w:webHidden/>
               </w:rPr>
-              <w:t>8</w:t>
+              <w:t>7</w:t>
             </w:r>
             <w:r>
               <w:rPr>
@@ -1309,7 +1300,7 @@
               <w:lang w:val="es-PE" w:eastAsia="es-PE"/>
             </w:rPr>
           </w:pPr>
-          <w:hyperlink w:anchor="_Toc243500535" w:history="1">
+          <w:hyperlink w:anchor="_Toc243515239" w:history="1">
             <w:r>
               <w:rPr>
                 <w:rStyle w:val="Hipervnculo"/>
@@ -1337,7 +1328,7 @@
                 <w:noProof/>
                 <w:webHidden/>
               </w:rPr>
-              <w:instrText xml:space="preserve"> PAGEREF _Toc243500535 \h </w:instrText>
+              <w:instrText xml:space="preserve"> PAGEREF _Toc243515239 \h </w:instrText>
             </w:r>
             <w:r>
               <w:rPr>
@@ -1357,7 +1348,7 @@
                 <w:noProof/>
                 <w:webHidden/>
               </w:rPr>
-              <w:t>9</w:t>
+              <w:t>8</w:t>
             </w:r>
             <w:r>
               <w:rPr>
@@ -1382,7 +1373,7 @@
               <w:lang w:val="es-PE" w:eastAsia="es-PE"/>
             </w:rPr>
           </w:pPr>
-          <w:hyperlink w:anchor="_Toc243500536" w:history="1">
+          <w:hyperlink w:anchor="_Toc243515240" w:history="1">
             <w:r>
               <w:rPr>
                 <w:rStyle w:val="Hipervnculo"/>
@@ -1410,7 +1401,7 @@
                 <w:noProof/>
                 <w:webHidden/>
               </w:rPr>
-              <w:instrText xml:space="preserve"> PAGEREF _Toc243500536 \h </w:instrText>
+              <w:instrText xml:space="preserve"> PAGEREF _Toc243515240 \h </w:instrText>
             </w:r>
             <w:r>
               <w:rPr>
@@ -1430,7 +1421,7 @@
                 <w:noProof/>
                 <w:webHidden/>
               </w:rPr>
-              <w:t>10</w:t>
+              <w:t>8</w:t>
             </w:r>
             <w:r>
               <w:rPr>
@@ -1455,7 +1446,7 @@
               <w:lang w:val="es-PE" w:eastAsia="es-PE"/>
             </w:rPr>
           </w:pPr>
-          <w:hyperlink w:anchor="_Toc243500537" w:history="1">
+          <w:hyperlink w:anchor="_Toc243515241" w:history="1">
             <w:r>
               <w:rPr>
                 <w:rStyle w:val="Hipervnculo"/>
@@ -1482,7 +1473,7 @@
                 <w:noProof/>
                 <w:webHidden/>
               </w:rPr>
-              <w:instrText xml:space="preserve"> PAGEREF _Toc243500537 \h </w:instrText>
+              <w:instrText xml:space="preserve"> PAGEREF _Toc243515241 \h </w:instrText>
             </w:r>
             <w:r>
               <w:rPr>
@@ -1502,7 +1493,7 @@
                 <w:noProof/>
                 <w:webHidden/>
               </w:rPr>
-              <w:t>10</w:t>
+              <w:t>9</w:t>
             </w:r>
             <w:r>
               <w:rPr>
@@ -1527,7 +1518,7 @@
               <w:lang w:val="es-PE" w:eastAsia="es-PE"/>
             </w:rPr>
           </w:pPr>
-          <w:hyperlink w:anchor="_Toc243500538" w:history="1">
+          <w:hyperlink w:anchor="_Toc243515242" w:history="1">
             <w:r>
               <w:rPr>
                 <w:rStyle w:val="Hipervnculo"/>
@@ -1555,7 +1546,7 @@
                 <w:noProof/>
                 <w:webHidden/>
               </w:rPr>
-              <w:instrText xml:space="preserve"> PAGEREF _Toc243500538 \h </w:instrText>
+              <w:instrText xml:space="preserve"> PAGEREF _Toc243515242 \h </w:instrText>
             </w:r>
             <w:r>
               <w:rPr>
@@ -1575,7 +1566,7 @@
                 <w:noProof/>
                 <w:webHidden/>
               </w:rPr>
-              <w:t>11</w:t>
+              <w:t>10</w:t>
             </w:r>
             <w:r>
               <w:rPr>
@@ -1597,7 +1588,7 @@
               <w:lang w:val="es-PE" w:eastAsia="es-PE"/>
             </w:rPr>
           </w:pPr>
-          <w:hyperlink w:anchor="_Toc243500539" w:history="1">
+          <w:hyperlink w:anchor="_Toc243515243" w:history="1">
             <w:r>
               <w:rPr>
                 <w:rStyle w:val="Hipervnculo"/>
@@ -1625,7 +1616,7 @@
                 <w:noProof/>
                 <w:webHidden/>
               </w:rPr>
-              <w:instrText xml:space="preserve"> PAGEREF _Toc243500539 \h </w:instrText>
+              <w:instrText xml:space="preserve"> PAGEREF _Toc243515243 \h </w:instrText>
             </w:r>
             <w:r>
               <w:rPr>
@@ -1645,7 +1636,7 @@
                 <w:noProof/>
                 <w:webHidden/>
               </w:rPr>
-              <w:t>12</w:t>
+              <w:t>11</w:t>
             </w:r>
             <w:r>
               <w:rPr>
@@ -1670,7 +1661,7 @@
               <w:lang w:val="es-PE" w:eastAsia="es-PE"/>
             </w:rPr>
           </w:pPr>
-          <w:hyperlink w:anchor="_Toc243500540" w:history="1">
+          <w:hyperlink w:anchor="_Toc243515244" w:history="1">
             <w:r>
               <w:rPr>
                 <w:rStyle w:val="Hipervnculo"/>
@@ -1698,7 +1689,7 @@
                 <w:noProof/>
                 <w:webHidden/>
               </w:rPr>
-              <w:instrText xml:space="preserve"> PAGEREF _Toc243500540 \h </w:instrText>
+              <w:instrText xml:space="preserve"> PAGEREF _Toc243515244 \h </w:instrText>
             </w:r>
             <w:r>
               <w:rPr>
@@ -1718,7 +1709,7 @@
                 <w:noProof/>
                 <w:webHidden/>
               </w:rPr>
-              <w:t>12</w:t>
+              <w:t>11</w:t>
             </w:r>
             <w:r>
               <w:rPr>
@@ -1743,7 +1734,7 @@
               <w:lang w:val="es-PE" w:eastAsia="es-PE"/>
             </w:rPr>
           </w:pPr>
-          <w:hyperlink w:anchor="_Toc243500541" w:history="1">
+          <w:hyperlink w:anchor="_Toc243515245" w:history="1">
             <w:r>
               <w:rPr>
                 <w:rStyle w:val="Hipervnculo"/>
@@ -1771,7 +1762,7 @@
                 <w:noProof/>
                 <w:webHidden/>
               </w:rPr>
-              <w:instrText xml:space="preserve"> PAGEREF _Toc243500541 \h </w:instrText>
+              <w:instrText xml:space="preserve"> PAGEREF _Toc243515245 \h </w:instrText>
             </w:r>
             <w:r>
               <w:rPr>
@@ -1791,7 +1782,7 @@
                 <w:noProof/>
                 <w:webHidden/>
               </w:rPr>
-              <w:t>14</w:t>
+              <w:t>13</w:t>
             </w:r>
             <w:r>
               <w:rPr>
@@ -1816,7 +1807,7 @@
               <w:lang w:val="es-PE" w:eastAsia="es-PE"/>
             </w:rPr>
           </w:pPr>
-          <w:hyperlink w:anchor="_Toc243500542" w:history="1">
+          <w:hyperlink w:anchor="_Toc243515246" w:history="1">
             <w:r>
               <w:rPr>
                 <w:rStyle w:val="Hipervnculo"/>
@@ -1844,7 +1835,7 @@
                 <w:noProof/>
                 <w:webHidden/>
               </w:rPr>
-              <w:instrText xml:space="preserve"> PAGEREF _Toc243500542 \h </w:instrText>
+              <w:instrText xml:space="preserve"> PAGEREF _Toc243515246 \h </w:instrText>
             </w:r>
             <w:r>
               <w:rPr>
@@ -1864,7 +1855,7 @@
                 <w:noProof/>
                 <w:webHidden/>
               </w:rPr>
-              <w:t>16</w:t>
+              <w:t>14</w:t>
             </w:r>
             <w:r>
               <w:rPr>
@@ -1889,7 +1880,7 @@
               <w:lang w:val="es-PE" w:eastAsia="es-PE"/>
             </w:rPr>
           </w:pPr>
-          <w:hyperlink w:anchor="_Toc243500543" w:history="1">
+          <w:hyperlink w:anchor="_Toc243515247" w:history="1">
             <w:r>
               <w:rPr>
                 <w:rStyle w:val="Hipervnculo"/>
@@ -1917,7 +1908,7 @@
                 <w:noProof/>
                 <w:webHidden/>
               </w:rPr>
-              <w:instrText xml:space="preserve"> PAGEREF _Toc243500543 \h </w:instrText>
+              <w:instrText xml:space="preserve"> PAGEREF _Toc243515247 \h </w:instrText>
             </w:r>
             <w:r>
               <w:rPr>
@@ -1937,7 +1928,7 @@
                 <w:noProof/>
                 <w:webHidden/>
               </w:rPr>
-              <w:t>17</w:t>
+              <w:t>16</w:t>
             </w:r>
             <w:r>
               <w:rPr>
@@ -1959,7 +1950,7 @@
               <w:lang w:val="es-PE" w:eastAsia="es-PE"/>
             </w:rPr>
           </w:pPr>
-          <w:hyperlink w:anchor="_Toc243500544" w:history="1">
+          <w:hyperlink w:anchor="_Toc243515248" w:history="1">
             <w:r>
               <w:rPr>
                 <w:rStyle w:val="Hipervnculo"/>
@@ -1987,7 +1978,7 @@
                 <w:noProof/>
                 <w:webHidden/>
               </w:rPr>
-              <w:instrText xml:space="preserve"> PAGEREF _Toc243500544 \h </w:instrText>
+              <w:instrText xml:space="preserve"> PAGEREF _Toc243515248 \h </w:instrText>
             </w:r>
             <w:r>
               <w:rPr>
@@ -2007,7 +1998,7 @@
                 <w:noProof/>
                 <w:webHidden/>
               </w:rPr>
-              <w:t>18</w:t>
+              <w:t>17</w:t>
             </w:r>
             <w:r>
               <w:rPr>
@@ -2032,7 +2023,7 @@
               <w:lang w:val="es-PE" w:eastAsia="es-PE"/>
             </w:rPr>
           </w:pPr>
-          <w:hyperlink w:anchor="_Toc243500545" w:history="1">
+          <w:hyperlink w:anchor="_Toc243515249" w:history="1">
             <w:r>
               <w:rPr>
                 <w:rStyle w:val="Hipervnculo"/>
@@ -2060,7 +2051,7 @@
                 <w:noProof/>
                 <w:webHidden/>
               </w:rPr>
-              <w:instrText xml:space="preserve"> PAGEREF _Toc243500545 \h </w:instrText>
+              <w:instrText xml:space="preserve"> PAGEREF _Toc243515249 \h </w:instrText>
             </w:r>
             <w:r>
               <w:rPr>
@@ -2080,7 +2071,7 @@
                 <w:noProof/>
                 <w:webHidden/>
               </w:rPr>
-              <w:t>18</w:t>
+              <w:t>17</w:t>
             </w:r>
             <w:r>
               <w:rPr>
@@ -2105,7 +2096,7 @@
               <w:lang w:val="es-PE" w:eastAsia="es-PE"/>
             </w:rPr>
           </w:pPr>
-          <w:hyperlink w:anchor="_Toc243500546" w:history="1">
+          <w:hyperlink w:anchor="_Toc243515250" w:history="1">
             <w:r>
               <w:rPr>
                 <w:rStyle w:val="Hipervnculo"/>
@@ -2133,7 +2124,7 @@
                 <w:noProof/>
                 <w:webHidden/>
               </w:rPr>
-              <w:instrText xml:space="preserve"> PAGEREF _Toc243500546 \h </w:instrText>
+              <w:instrText xml:space="preserve"> PAGEREF _Toc243515250 \h </w:instrText>
             </w:r>
             <w:r>
               <w:rPr>
@@ -2153,7 +2144,7 @@
                 <w:noProof/>
                 <w:webHidden/>
               </w:rPr>
-              <w:t>21</w:t>
+              <w:t>20</w:t>
             </w:r>
             <w:r>
               <w:rPr>
@@ -2178,7 +2169,7 @@
               <w:lang w:val="es-PE" w:eastAsia="es-PE"/>
             </w:rPr>
           </w:pPr>
-          <w:hyperlink w:anchor="_Toc243500547" w:history="1">
+          <w:hyperlink w:anchor="_Toc243515251" w:history="1">
             <w:r>
               <w:rPr>
                 <w:rStyle w:val="Hipervnculo"/>
@@ -2206,7 +2197,7 @@
                 <w:noProof/>
                 <w:webHidden/>
               </w:rPr>
-              <w:instrText xml:space="preserve"> PAGEREF _Toc243500547 \h </w:instrText>
+              <w:instrText xml:space="preserve"> PAGEREF _Toc243515251 \h </w:instrText>
             </w:r>
             <w:r>
               <w:rPr>
@@ -2226,7 +2217,7 @@
                 <w:noProof/>
                 <w:webHidden/>
               </w:rPr>
-              <w:t>23</w:t>
+              <w:t>22</w:t>
             </w:r>
             <w:r>
               <w:rPr>
@@ -2251,7 +2242,7 @@
               <w:lang w:val="es-PE" w:eastAsia="es-PE"/>
             </w:rPr>
           </w:pPr>
-          <w:hyperlink w:anchor="_Toc243500548" w:history="1">
+          <w:hyperlink w:anchor="_Toc243515252" w:history="1">
             <w:r>
               <w:rPr>
                 <w:rStyle w:val="Hipervnculo"/>
@@ -2279,7 +2270,7 @@
                 <w:noProof/>
                 <w:webHidden/>
               </w:rPr>
-              <w:instrText xml:space="preserve"> PAGEREF _Toc243500548 \h </w:instrText>
+              <w:instrText xml:space="preserve"> PAGEREF _Toc243515252 \h </w:instrText>
             </w:r>
             <w:r>
               <w:rPr>
@@ -2299,7 +2290,7 @@
                 <w:noProof/>
                 <w:webHidden/>
               </w:rPr>
-              <w:t>25</w:t>
+              <w:t>24</w:t>
             </w:r>
             <w:r>
               <w:rPr>
@@ -2324,7 +2315,7 @@
               <w:lang w:val="es-PE" w:eastAsia="es-PE"/>
             </w:rPr>
           </w:pPr>
-          <w:hyperlink w:anchor="_Toc243500549" w:history="1">
+          <w:hyperlink w:anchor="_Toc243515253" w:history="1">
             <w:r>
               <w:rPr>
                 <w:rStyle w:val="Hipervnculo"/>
@@ -2352,7 +2343,7 @@
                 <w:noProof/>
                 <w:webHidden/>
               </w:rPr>
-              <w:instrText xml:space="preserve"> PAGEREF _Toc243500549 \h </w:instrText>
+              <w:instrText xml:space="preserve"> PAGEREF _Toc243515253 \h </w:instrText>
             </w:r>
             <w:r>
               <w:rPr>
@@ -2372,7 +2363,7 @@
                 <w:noProof/>
                 <w:webHidden/>
               </w:rPr>
-              <w:t>25</w:t>
+              <w:t>24</w:t>
             </w:r>
             <w:r>
               <w:rPr>
@@ -2397,7 +2388,7 @@
               <w:lang w:val="es-PE" w:eastAsia="es-PE"/>
             </w:rPr>
           </w:pPr>
-          <w:hyperlink w:anchor="_Toc243500550" w:history="1">
+          <w:hyperlink w:anchor="_Toc243515254" w:history="1">
             <w:r>
               <w:rPr>
                 <w:rStyle w:val="Hipervnculo"/>
@@ -2425,7 +2416,7 @@
                 <w:noProof/>
                 <w:webHidden/>
               </w:rPr>
-              <w:instrText xml:space="preserve"> PAGEREF _Toc243500550 \h </w:instrText>
+              <w:instrText xml:space="preserve"> PAGEREF _Toc243515254 \h </w:instrText>
             </w:r>
             <w:r>
               <w:rPr>
@@ -2445,7 +2436,7 @@
                 <w:noProof/>
                 <w:webHidden/>
               </w:rPr>
-              <w:t>29</w:t>
+              <w:t>28</w:t>
             </w:r>
             <w:r>
               <w:rPr>
@@ -2470,7 +2461,7 @@
               <w:lang w:val="es-PE" w:eastAsia="es-PE"/>
             </w:rPr>
           </w:pPr>
-          <w:hyperlink w:anchor="_Toc243500551" w:history="1">
+          <w:hyperlink w:anchor="_Toc243515255" w:history="1">
             <w:r>
               <w:rPr>
                 <w:rStyle w:val="Hipervnculo"/>
@@ -2498,7 +2489,7 @@
                 <w:noProof/>
                 <w:webHidden/>
               </w:rPr>
-              <w:instrText xml:space="preserve"> PAGEREF _Toc243500551 \h </w:instrText>
+              <w:instrText xml:space="preserve"> PAGEREF _Toc243515255 \h </w:instrText>
             </w:r>
             <w:r>
               <w:rPr>
@@ -2518,7 +2509,7 @@
                 <w:noProof/>
                 <w:webHidden/>
               </w:rPr>
-              <w:t>33</w:t>
+              <w:t>32</w:t>
             </w:r>
             <w:r>
               <w:rPr>
@@ -2543,7 +2534,7 @@
               <w:lang w:val="es-PE" w:eastAsia="es-PE"/>
             </w:rPr>
           </w:pPr>
-          <w:hyperlink w:anchor="_Toc243500552" w:history="1">
+          <w:hyperlink w:anchor="_Toc243515256" w:history="1">
             <w:r>
               <w:rPr>
                 <w:rStyle w:val="Hipervnculo"/>
@@ -2571,7 +2562,7 @@
                 <w:noProof/>
                 <w:webHidden/>
               </w:rPr>
-              <w:instrText xml:space="preserve"> PAGEREF _Toc243500552 \h </w:instrText>
+              <w:instrText xml:space="preserve"> PAGEREF _Toc243515256 \h </w:instrText>
             </w:r>
             <w:r>
               <w:rPr>
@@ -2591,7 +2582,7 @@
                 <w:noProof/>
                 <w:webHidden/>
               </w:rPr>
-              <w:t>37</w:t>
+              <w:t>36</w:t>
             </w:r>
             <w:r>
               <w:rPr>
@@ -2616,11 +2607,12 @@
               <w:lang w:val="es-PE" w:eastAsia="es-PE"/>
             </w:rPr>
           </w:pPr>
-          <w:hyperlink w:anchor="_Toc243500553" w:history="1">
+          <w:hyperlink w:anchor="_Toc243515257" w:history="1">
             <w:r>
               <w:rPr>
                 <w:rStyle w:val="Hipervnculo"/>
                 <w:noProof/>
+                <w:lang w:val="es-PE"/>
               </w:rPr>
               <w:t>3.5 Diseño de la solución Big Data</w:t>
             </w:r>
@@ -2643,7 +2635,7 @@
                 <w:noProof/>
                 <w:webHidden/>
               </w:rPr>
-              <w:instrText xml:space="preserve"> PAGEREF _Toc243500553 \h </w:instrText>
+              <w:instrText xml:space="preserve"> PAGEREF _Toc243515257 \h </w:instrText>
             </w:r>
             <w:r>
               <w:rPr>
@@ -2663,7 +2655,7 @@
                 <w:noProof/>
                 <w:webHidden/>
               </w:rPr>
-              <w:t>38</w:t>
+              <w:t>37</w:t>
             </w:r>
             <w:r>
               <w:rPr>
@@ -2688,11 +2680,12 @@
               <w:lang w:val="es-PE" w:eastAsia="es-PE"/>
             </w:rPr>
           </w:pPr>
-          <w:hyperlink w:anchor="_Toc243500554" w:history="1">
+          <w:hyperlink w:anchor="_Toc243515258" w:history="1">
             <w:r>
               <w:rPr>
                 <w:rStyle w:val="Hipervnculo"/>
                 <w:noProof/>
+                <w:lang w:val="es-PE"/>
               </w:rPr>
               <w:t>3.5.1 Justificación y requisitos Big Data</w:t>
             </w:r>
@@ -2715,7 +2708,7 @@
                 <w:noProof/>
                 <w:webHidden/>
               </w:rPr>
-              <w:instrText xml:space="preserve"> PAGEREF _Toc243500554 \h </w:instrText>
+              <w:instrText xml:space="preserve"> PAGEREF _Toc243515258 \h </w:instrText>
             </w:r>
             <w:r>
               <w:rPr>
@@ -2735,7 +2728,7 @@
                 <w:noProof/>
                 <w:webHidden/>
               </w:rPr>
-              <w:t>39</w:t>
+              <w:t>38</w:t>
             </w:r>
             <w:r>
               <w:rPr>
@@ -2760,11 +2753,12 @@
               <w:lang w:val="es-PE" w:eastAsia="es-PE"/>
             </w:rPr>
           </w:pPr>
-          <w:hyperlink w:anchor="_Toc243500555" w:history="1">
+          <w:hyperlink w:anchor="_Toc243515259" w:history="1">
             <w:r>
               <w:rPr>
                 <w:rStyle w:val="Hipervnculo"/>
                 <w:noProof/>
+                <w:lang w:val="es-PE"/>
               </w:rPr>
               <w:t>3.5.2 Arquitectura y componentes</w:t>
             </w:r>
@@ -2787,7 +2781,7 @@
                 <w:noProof/>
                 <w:webHidden/>
               </w:rPr>
-              <w:instrText xml:space="preserve"> PAGEREF _Toc243500555 \h </w:instrText>
+              <w:instrText xml:space="preserve"> PAGEREF _Toc243515259 \h </w:instrText>
             </w:r>
             <w:r>
               <w:rPr>
@@ -2807,7 +2801,7 @@
                 <w:noProof/>
                 <w:webHidden/>
               </w:rPr>
-              <w:t>39</w:t>
+              <w:t>38</w:t>
             </w:r>
             <w:r>
               <w:rPr>
@@ -2832,11 +2826,12 @@
               <w:lang w:val="es-PE" w:eastAsia="es-PE"/>
             </w:rPr>
           </w:pPr>
-          <w:hyperlink w:anchor="_Toc243500556" w:history="1">
+          <w:hyperlink w:anchor="_Toc243515260" w:history="1">
             <w:r>
               <w:rPr>
                 <w:rStyle w:val="Hipervnculo"/>
                 <w:noProof/>
+                <w:lang w:val="es-PE"/>
               </w:rPr>
               <w:t>3.5.3 Modelo y ciclo de vida de datos</w:t>
             </w:r>
@@ -2859,7 +2854,7 @@
                 <w:noProof/>
                 <w:webHidden/>
               </w:rPr>
-              <w:instrText xml:space="preserve"> PAGEREF _Toc243500556 \h </w:instrText>
+              <w:instrText xml:space="preserve"> PAGEREF _Toc243515260 \h </w:instrText>
             </w:r>
             <w:r>
               <w:rPr>
@@ -2879,7 +2874,7 @@
                 <w:noProof/>
                 <w:webHidden/>
               </w:rPr>
-              <w:t>39</w:t>
+              <w:t>38</w:t>
             </w:r>
             <w:r>
               <w:rPr>
@@ -2904,11 +2899,12 @@
               <w:lang w:val="es-PE" w:eastAsia="es-PE"/>
             </w:rPr>
           </w:pPr>
-          <w:hyperlink w:anchor="_Toc243500557" w:history="1">
+          <w:hyperlink w:anchor="_Toc243515261" w:history="1">
             <w:r>
               <w:rPr>
                 <w:rStyle w:val="Hipervnculo"/>
                 <w:noProof/>
+                <w:lang w:val="es-PE"/>
               </w:rPr>
               <w:t>3.5.4 Escalabilidad, resiliencia y operación</w:t>
             </w:r>
@@ -2931,7 +2927,7 @@
                 <w:noProof/>
                 <w:webHidden/>
               </w:rPr>
-              <w:instrText xml:space="preserve"> PAGEREF _Toc243500557 \h </w:instrText>
+              <w:instrText xml:space="preserve"> PAGEREF _Toc243515261 \h </w:instrText>
             </w:r>
             <w:r>
               <w:rPr>
@@ -2951,7 +2947,7 @@
                 <w:noProof/>
                 <w:webHidden/>
               </w:rPr>
-              <w:t>39</w:t>
+              <w:t>38</w:t>
             </w:r>
             <w:r>
               <w:rPr>
@@ -2976,11 +2972,12 @@
               <w:lang w:val="es-PE" w:eastAsia="es-PE"/>
             </w:rPr>
           </w:pPr>
-          <w:hyperlink w:anchor="_Toc243500558" w:history="1">
+          <w:hyperlink w:anchor="_Toc243515262" w:history="1">
             <w:r>
               <w:rPr>
                 <w:rStyle w:val="Hipervnculo"/>
                 <w:noProof/>
+                <w:lang w:val="es-PE"/>
               </w:rPr>
               <w:t>3.5.5 Resultados</w:t>
             </w:r>
@@ -3003,7 +3000,7 @@
                 <w:noProof/>
                 <w:webHidden/>
               </w:rPr>
-              <w:instrText xml:space="preserve"> PAGEREF _Toc243500558 \h </w:instrText>
+              <w:instrText xml:space="preserve"> PAGEREF _Toc243515262 \h </w:instrText>
             </w:r>
             <w:r>
               <w:rPr>
@@ -3023,7 +3020,7 @@
                 <w:noProof/>
                 <w:webHidden/>
               </w:rPr>
-              <w:t>39</w:t>
+              <w:t>38</w:t>
             </w:r>
             <w:r>
               <w:rPr>
@@ -3048,7 +3045,7 @@
               <w:lang w:val="es-PE" w:eastAsia="es-PE"/>
             </w:rPr>
           </w:pPr>
-          <w:hyperlink w:anchor="_Toc243500559" w:history="1">
+          <w:hyperlink w:anchor="_Toc243515263" w:history="1">
             <w:r>
               <w:rPr>
                 <w:rStyle w:val="Hipervnculo"/>
@@ -3076,7 +3073,7 @@
                 <w:noProof/>
                 <w:webHidden/>
               </w:rPr>
-              <w:instrText xml:space="preserve"> PAGEREF _Toc243500559 \h </w:instrText>
+              <w:instrText xml:space="preserve"> PAGEREF _Toc243515263 \h </w:instrText>
             </w:r>
             <w:r>
               <w:rPr>
@@ -3096,7 +3093,7 @@
                 <w:noProof/>
                 <w:webHidden/>
               </w:rPr>
-              <w:t>39</w:t>
+              <w:t>38</w:t>
             </w:r>
             <w:r>
               <w:rPr>
@@ -3121,7 +3118,7 @@
               <w:lang w:val="es-PE" w:eastAsia="es-PE"/>
             </w:rPr>
           </w:pPr>
-          <w:hyperlink w:anchor="_Toc243500560" w:history="1">
+          <w:hyperlink w:anchor="_Toc243515264" w:history="1">
             <w:r>
               <w:rPr>
                 <w:rStyle w:val="Hipervnculo"/>
@@ -3149,7 +3146,7 @@
                 <w:noProof/>
                 <w:webHidden/>
               </w:rPr>
-              <w:instrText xml:space="preserve"> PAGEREF _Toc243500560 \h </w:instrText>
+              <w:instrText xml:space="preserve"> PAGEREF _Toc243515264 \h </w:instrText>
             </w:r>
             <w:r>
               <w:rPr>
@@ -3169,7 +3166,7 @@
                 <w:noProof/>
                 <w:webHidden/>
               </w:rPr>
-              <w:t>41</w:t>
+              <w:t>40</w:t>
             </w:r>
             <w:r>
               <w:rPr>
@@ -3191,11 +3188,12 @@
               <w:lang w:val="es-PE" w:eastAsia="es-PE"/>
             </w:rPr>
           </w:pPr>
-          <w:hyperlink w:anchor="_Toc243500561" w:history="1">
+          <w:hyperlink w:anchor="_Toc243515265" w:history="1">
             <w:r>
               <w:rPr>
                 <w:rStyle w:val="Hipervnculo"/>
                 <w:noProof/>
+                <w:lang w:val="es-PE"/>
               </w:rPr>
               <w:t>CAPÍTULO IV: DISEÑO DEL EXPERIMENTO</w:t>
             </w:r>
@@ -3218,7 +3216,7 @@
                 <w:noProof/>
                 <w:webHidden/>
               </w:rPr>
-              <w:instrText xml:space="preserve"> PAGEREF _Toc243500561 \h </w:instrText>
+              <w:instrText xml:space="preserve"> PAGEREF _Toc243515265 \h </w:instrText>
             </w:r>
             <w:r>
               <w:rPr>
@@ -3238,7 +3236,7 @@
                 <w:noProof/>
                 <w:webHidden/>
               </w:rPr>
-              <w:t>42</w:t>
+              <w:t>41</w:t>
             </w:r>
             <w:r>
               <w:rPr>
@@ -3263,7 +3261,7 @@
               <w:lang w:val="es-PE" w:eastAsia="es-PE"/>
             </w:rPr>
           </w:pPr>
-          <w:hyperlink w:anchor="_Toc243500562" w:history="1">
+          <w:hyperlink w:anchor="_Toc243515266" w:history="1">
             <w:r>
               <w:rPr>
                 <w:rStyle w:val="Hipervnculo"/>
@@ -3291,7 +3289,7 @@
                 <w:noProof/>
                 <w:webHidden/>
               </w:rPr>
-              <w:instrText xml:space="preserve"> PAGEREF _Toc243500562 \h </w:instrText>
+              <w:instrText xml:space="preserve"> PAGEREF _Toc243515266 \h </w:instrText>
             </w:r>
             <w:r>
               <w:rPr>
@@ -3311,7 +3309,7 @@
                 <w:noProof/>
                 <w:webHidden/>
               </w:rPr>
-              <w:t>42</w:t>
+              <w:t>41</w:t>
             </w:r>
             <w:r>
               <w:rPr>
@@ -3336,7 +3334,7 @@
               <w:lang w:val="es-PE" w:eastAsia="es-PE"/>
             </w:rPr>
           </w:pPr>
-          <w:hyperlink w:anchor="_Toc243500563" w:history="1">
+          <w:hyperlink w:anchor="_Toc243515267" w:history="1">
             <w:r>
               <w:rPr>
                 <w:rStyle w:val="Hipervnculo"/>
@@ -3363,7 +3361,7 @@
                 <w:noProof/>
                 <w:webHidden/>
               </w:rPr>
-              <w:instrText xml:space="preserve"> PAGEREF _Toc243500563 \h </w:instrText>
+              <w:instrText xml:space="preserve"> PAGEREF _Toc243515267 \h </w:instrText>
             </w:r>
             <w:r>
               <w:rPr>
@@ -3383,7 +3381,7 @@
                 <w:noProof/>
                 <w:webHidden/>
               </w:rPr>
-              <w:t>43</w:t>
+              <w:t>42</w:t>
             </w:r>
             <w:r>
               <w:rPr>
@@ -3408,7 +3406,7 @@
               <w:lang w:val="es-PE" w:eastAsia="es-PE"/>
             </w:rPr>
           </w:pPr>
-          <w:hyperlink w:anchor="_Toc243500564" w:history="1">
+          <w:hyperlink w:anchor="_Toc243515268" w:history="1">
             <w:r>
               <w:rPr>
                 <w:rStyle w:val="Hipervnculo"/>
@@ -3436,7 +3434,7 @@
                 <w:noProof/>
                 <w:webHidden/>
               </w:rPr>
-              <w:instrText xml:space="preserve"> PAGEREF _Toc243500564 \h </w:instrText>
+              <w:instrText xml:space="preserve"> PAGEREF _Toc243515268 \h </w:instrText>
             </w:r>
             <w:r>
               <w:rPr>
@@ -3456,7 +3454,7 @@
                 <w:noProof/>
                 <w:webHidden/>
               </w:rPr>
-              <w:t>44</w:t>
+              <w:t>43</w:t>
             </w:r>
             <w:r>
               <w:rPr>
@@ -3481,7 +3479,7 @@
               <w:lang w:val="es-PE" w:eastAsia="es-PE"/>
             </w:rPr>
           </w:pPr>
-          <w:hyperlink w:anchor="_Toc243500565" w:history="1">
+          <w:hyperlink w:anchor="_Toc243515269" w:history="1">
             <w:r>
               <w:rPr>
                 <w:rStyle w:val="Hipervnculo"/>
@@ -3508,7 +3506,7 @@
                 <w:noProof/>
                 <w:webHidden/>
               </w:rPr>
-              <w:instrText xml:space="preserve"> PAGEREF _Toc243500565 \h </w:instrText>
+              <w:instrText xml:space="preserve"> PAGEREF _Toc243515269 \h </w:instrText>
             </w:r>
             <w:r>
               <w:rPr>
@@ -3528,7 +3526,7 @@
                 <w:noProof/>
                 <w:webHidden/>
               </w:rPr>
-              <w:t>46</w:t>
+              <w:t>45</w:t>
             </w:r>
             <w:r>
               <w:rPr>
@@ -3553,7 +3551,7 @@
               <w:lang w:val="es-PE" w:eastAsia="es-PE"/>
             </w:rPr>
           </w:pPr>
-          <w:hyperlink w:anchor="_Toc243500566" w:history="1">
+          <w:hyperlink w:anchor="_Toc243515270" w:history="1">
             <w:r>
               <w:rPr>
                 <w:rStyle w:val="Hipervnculo"/>
@@ -3580,7 +3578,7 @@
                 <w:noProof/>
                 <w:webHidden/>
               </w:rPr>
-              <w:instrText xml:space="preserve"> PAGEREF _Toc243500566 \h </w:instrText>
+              <w:instrText xml:space="preserve"> PAGEREF _Toc243515270 \h </w:instrText>
             </w:r>
             <w:r>
               <w:rPr>
@@ -3600,7 +3598,7 @@
                 <w:noProof/>
                 <w:webHidden/>
               </w:rPr>
-              <w:t>47</w:t>
+              <w:t>46</w:t>
             </w:r>
             <w:r>
               <w:rPr>
@@ -3625,7 +3623,7 @@
               <w:lang w:val="es-PE" w:eastAsia="es-PE"/>
             </w:rPr>
           </w:pPr>
-          <w:hyperlink w:anchor="_Toc243500567" w:history="1">
+          <w:hyperlink w:anchor="_Toc243515271" w:history="1">
             <w:r>
               <w:rPr>
                 <w:rStyle w:val="Hipervnculo"/>
@@ -3652,7 +3650,7 @@
                 <w:noProof/>
                 <w:webHidden/>
               </w:rPr>
-              <w:instrText xml:space="preserve"> PAGEREF _Toc243500567 \h </w:instrText>
+              <w:instrText xml:space="preserve"> PAGEREF _Toc243515271 \h </w:instrText>
             </w:r>
             <w:r>
               <w:rPr>
@@ -3672,7 +3670,7 @@
                 <w:noProof/>
                 <w:webHidden/>
               </w:rPr>
-              <w:t>49</w:t>
+              <w:t>48</w:t>
             </w:r>
             <w:r>
               <w:rPr>
@@ -3697,7 +3695,7 @@
               <w:lang w:val="es-PE" w:eastAsia="es-PE"/>
             </w:rPr>
           </w:pPr>
-          <w:hyperlink w:anchor="_Toc243500568" w:history="1">
+          <w:hyperlink w:anchor="_Toc243515272" w:history="1">
             <w:r>
               <w:rPr>
                 <w:rStyle w:val="Hipervnculo"/>
@@ -3725,7 +3723,7 @@
                 <w:noProof/>
                 <w:webHidden/>
               </w:rPr>
-              <w:instrText xml:space="preserve"> PAGEREF _Toc243500568 \h </w:instrText>
+              <w:instrText xml:space="preserve"> PAGEREF _Toc243515272 \h </w:instrText>
             </w:r>
             <w:r>
               <w:rPr>
@@ -3745,7 +3743,7 @@
                 <w:noProof/>
                 <w:webHidden/>
               </w:rPr>
-              <w:t>49</w:t>
+              <w:t>48</w:t>
             </w:r>
             <w:r>
               <w:rPr>
@@ -3767,7 +3765,7 @@
               <w:lang w:val="es-PE" w:eastAsia="es-PE"/>
             </w:rPr>
           </w:pPr>
-          <w:hyperlink w:anchor="_Toc243500569" w:history="1">
+          <w:hyperlink w:anchor="_Toc243515273" w:history="1">
             <w:r>
               <w:rPr>
                 <w:rStyle w:val="Hipervnculo"/>
@@ -3795,7 +3793,7 @@
                 <w:noProof/>
                 <w:webHidden/>
               </w:rPr>
-              <w:instrText xml:space="preserve"> PAGEREF _Toc243500569 \h </w:instrText>
+              <w:instrText xml:space="preserve"> PAGEREF _Toc243515273 \h </w:instrText>
             </w:r>
             <w:r>
               <w:rPr>
@@ -3815,7 +3813,7 @@
                 <w:noProof/>
                 <w:webHidden/>
               </w:rPr>
-              <w:t>50</w:t>
+              <w:t>49</w:t>
             </w:r>
             <w:r>
               <w:rPr>
@@ -3840,7 +3838,7 @@
               <w:lang w:val="es-PE" w:eastAsia="es-PE"/>
             </w:rPr>
           </w:pPr>
-          <w:hyperlink w:anchor="_Toc243500570" w:history="1">
+          <w:hyperlink w:anchor="_Toc243515274" w:history="1">
             <w:r>
               <w:rPr>
                 <w:rStyle w:val="Hipervnculo"/>
@@ -3868,7 +3866,7 @@
                 <w:noProof/>
                 <w:webHidden/>
               </w:rPr>
-              <w:instrText xml:space="preserve"> PAGEREF _Toc243500570 \h </w:instrText>
+              <w:instrText xml:space="preserve"> PAGEREF _Toc243515274 \h </w:instrText>
             </w:r>
             <w:r>
               <w:rPr>
@@ -3888,7 +3886,7 @@
                 <w:noProof/>
                 <w:webHidden/>
               </w:rPr>
-              <w:t>50</w:t>
+              <w:t>49</w:t>
             </w:r>
             <w:r>
               <w:rPr>
@@ -3913,7 +3911,7 @@
               <w:lang w:val="es-PE" w:eastAsia="es-PE"/>
             </w:rPr>
           </w:pPr>
-          <w:hyperlink w:anchor="_Toc243500571" w:history="1">
+          <w:hyperlink w:anchor="_Toc243515275" w:history="1">
             <w:r>
               <w:rPr>
                 <w:rStyle w:val="Hipervnculo"/>
@@ -3941,7 +3939,7 @@
                 <w:noProof/>
                 <w:webHidden/>
               </w:rPr>
-              <w:instrText xml:space="preserve"> PAGEREF _Toc243500571 \h </w:instrText>
+              <w:instrText xml:space="preserve"> PAGEREF _Toc243515275 \h </w:instrText>
             </w:r>
             <w:r>
               <w:rPr>
@@ -3961,7 +3959,7 @@
                 <w:noProof/>
                 <w:webHidden/>
               </w:rPr>
-              <w:t>51</w:t>
+              <w:t>50</w:t>
             </w:r>
             <w:r>
               <w:rPr>
@@ -3986,7 +3984,7 @@
               <w:lang w:val="es-PE" w:eastAsia="es-PE"/>
             </w:rPr>
           </w:pPr>
-          <w:hyperlink w:anchor="_Toc243500572" w:history="1">
+          <w:hyperlink w:anchor="_Toc243515276" w:history="1">
             <w:r>
               <w:rPr>
                 <w:rStyle w:val="Hipervnculo"/>
@@ -4014,7 +4012,7 @@
                 <w:noProof/>
                 <w:webHidden/>
               </w:rPr>
-              <w:instrText xml:space="preserve"> PAGEREF _Toc243500572 \h </w:instrText>
+              <w:instrText xml:space="preserve"> PAGEREF _Toc243515276 \h </w:instrText>
             </w:r>
             <w:r>
               <w:rPr>
@@ -4034,7 +4032,7 @@
                 <w:noProof/>
                 <w:webHidden/>
               </w:rPr>
-              <w:t>51</w:t>
+              <w:t>50</w:t>
             </w:r>
             <w:r>
               <w:rPr>
@@ -4059,7 +4057,7 @@
               <w:lang w:val="es-PE" w:eastAsia="es-PE"/>
             </w:rPr>
           </w:pPr>
-          <w:hyperlink w:anchor="_Toc243500573" w:history="1">
+          <w:hyperlink w:anchor="_Toc243515277" w:history="1">
             <w:r>
               <w:rPr>
                 <w:rStyle w:val="Hipervnculo"/>
@@ -4087,7 +4085,7 @@
                 <w:noProof/>
                 <w:webHidden/>
               </w:rPr>
-              <w:instrText xml:space="preserve"> PAGEREF _Toc243500573 \h </w:instrText>
+              <w:instrText xml:space="preserve"> PAGEREF _Toc243515277 \h </w:instrText>
             </w:r>
             <w:r>
               <w:rPr>
@@ -4107,7 +4105,7 @@
                 <w:noProof/>
                 <w:webHidden/>
               </w:rPr>
-              <w:t>51</w:t>
+              <w:t>50</w:t>
             </w:r>
             <w:r>
               <w:rPr>
@@ -4132,7 +4130,7 @@
               <w:lang w:val="es-PE" w:eastAsia="es-PE"/>
             </w:rPr>
           </w:pPr>
-          <w:hyperlink w:anchor="_Toc243500574" w:history="1">
+          <w:hyperlink w:anchor="_Toc243515278" w:history="1">
             <w:r>
               <w:rPr>
                 <w:rStyle w:val="Hipervnculo"/>
@@ -4159,7 +4157,7 @@
                 <w:noProof/>
                 <w:webHidden/>
               </w:rPr>
-              <w:instrText xml:space="preserve"> PAGEREF _Toc243500574 \h </w:instrText>
+              <w:instrText xml:space="preserve"> PAGEREF _Toc243515278 \h </w:instrText>
             </w:r>
             <w:r>
               <w:rPr>
@@ -4179,7 +4177,7 @@
                 <w:noProof/>
                 <w:webHidden/>
               </w:rPr>
-              <w:t>53</w:t>
+              <w:t>52</w:t>
             </w:r>
             <w:r>
               <w:rPr>
@@ -4204,7 +4202,7 @@
               <w:lang w:val="es-PE" w:eastAsia="es-PE"/>
             </w:rPr>
           </w:pPr>
-          <w:hyperlink w:anchor="_Toc243500575" w:history="1">
+          <w:hyperlink w:anchor="_Toc243515279" w:history="1">
             <w:r>
               <w:rPr>
                 <w:rStyle w:val="Hipervnculo"/>
@@ -4231,7 +4229,7 @@
                 <w:noProof/>
                 <w:webHidden/>
               </w:rPr>
-              <w:instrText xml:space="preserve"> PAGEREF _Toc243500575 \h </w:instrText>
+              <w:instrText xml:space="preserve"> PAGEREF _Toc243515279 \h </w:instrText>
             </w:r>
             <w:r>
               <w:rPr>
@@ -4251,7 +4249,7 @@
                 <w:noProof/>
                 <w:webHidden/>
               </w:rPr>
-              <w:t>54</w:t>
+              <w:t>53</w:t>
             </w:r>
             <w:r>
               <w:rPr>
@@ -4276,7 +4274,7 @@
               <w:lang w:val="es-PE" w:eastAsia="es-PE"/>
             </w:rPr>
           </w:pPr>
-          <w:hyperlink w:anchor="_Toc243500576" w:history="1">
+          <w:hyperlink w:anchor="_Toc243515280" w:history="1">
             <w:r>
               <w:rPr>
                 <w:rStyle w:val="Hipervnculo"/>
@@ -4304,7 +4302,7 @@
                 <w:noProof/>
                 <w:webHidden/>
               </w:rPr>
-              <w:instrText xml:space="preserve"> PAGEREF _Toc243500576 \h </w:instrText>
+              <w:instrText xml:space="preserve"> PAGEREF _Toc243515280 \h </w:instrText>
             </w:r>
             <w:r>
               <w:rPr>
@@ -4324,7 +4322,7 @@
                 <w:noProof/>
                 <w:webHidden/>
               </w:rPr>
-              <w:t>56</w:t>
+              <w:t>55</w:t>
             </w:r>
             <w:r>
               <w:rPr>
@@ -4346,7 +4344,7 @@
               <w:lang w:val="es-PE" w:eastAsia="es-PE"/>
             </w:rPr>
           </w:pPr>
-          <w:hyperlink w:anchor="_Toc243500577" w:history="1">
+          <w:hyperlink w:anchor="_Toc243515281" w:history="1">
             <w:r>
               <w:rPr>
                 <w:rStyle w:val="Hipervnculo"/>
@@ -4374,7 +4372,7 @@
                 <w:noProof/>
                 <w:webHidden/>
               </w:rPr>
-              <w:instrText xml:space="preserve"> PAGEREF _Toc243500577 \h </w:instrText>
+              <w:instrText xml:space="preserve"> PAGEREF _Toc243515281 \h </w:instrText>
             </w:r>
             <w:r>
               <w:rPr>
@@ -4394,7 +4392,7 @@
                 <w:noProof/>
                 <w:webHidden/>
               </w:rPr>
-              <w:t>58</w:t>
+              <w:t>57</w:t>
             </w:r>
             <w:r>
               <w:rPr>
@@ -4419,7 +4417,7 @@
               <w:lang w:val="es-PE" w:eastAsia="es-PE"/>
             </w:rPr>
           </w:pPr>
-          <w:hyperlink w:anchor="_Toc243500578" w:history="1">
+          <w:hyperlink w:anchor="_Toc243515282" w:history="1">
             <w:r>
               <w:rPr>
                 <w:rStyle w:val="Hipervnculo"/>
@@ -4447,7 +4445,7 @@
                 <w:noProof/>
                 <w:webHidden/>
               </w:rPr>
-              <w:instrText xml:space="preserve"> PAGEREF _Toc243500578 \h </w:instrText>
+              <w:instrText xml:space="preserve"> PAGEREF _Toc243515282 \h </w:instrText>
             </w:r>
             <w:r>
               <w:rPr>
@@ -4467,7 +4465,7 @@
                 <w:noProof/>
                 <w:webHidden/>
               </w:rPr>
-              <w:t>58</w:t>
+              <w:t>57</w:t>
             </w:r>
             <w:r>
               <w:rPr>
@@ -4492,7 +4490,7 @@
               <w:lang w:val="es-PE" w:eastAsia="es-PE"/>
             </w:rPr>
           </w:pPr>
-          <w:hyperlink w:anchor="_Toc243500579" w:history="1">
+          <w:hyperlink w:anchor="_Toc243515283" w:history="1">
             <w:r>
               <w:rPr>
                 <w:rStyle w:val="Hipervnculo"/>
@@ -4520,7 +4518,7 @@
                 <w:noProof/>
                 <w:webHidden/>
               </w:rPr>
-              <w:instrText xml:space="preserve"> PAGEREF _Toc243500579 \h </w:instrText>
+              <w:instrText xml:space="preserve"> PAGEREF _Toc243515283 \h </w:instrText>
             </w:r>
             <w:r>
               <w:rPr>
@@ -4540,7 +4538,7 @@
                 <w:noProof/>
                 <w:webHidden/>
               </w:rPr>
-              <w:t>59</w:t>
+              <w:t>58</w:t>
             </w:r>
             <w:r>
               <w:rPr>
@@ -4565,7 +4563,7 @@
               <w:lang w:val="es-PE" w:eastAsia="es-PE"/>
             </w:rPr>
           </w:pPr>
-          <w:hyperlink w:anchor="_Toc243500580" w:history="1">
+          <w:hyperlink w:anchor="_Toc243515284" w:history="1">
             <w:r>
               <w:rPr>
                 <w:rStyle w:val="Hipervnculo"/>
@@ -4593,7 +4591,7 @@
                 <w:noProof/>
                 <w:webHidden/>
               </w:rPr>
-              <w:instrText xml:space="preserve"> PAGEREF _Toc243500580 \h </w:instrText>
+              <w:instrText xml:space="preserve"> PAGEREF _Toc243515284 \h </w:instrText>
             </w:r>
             <w:r>
               <w:rPr>
@@ -4613,7 +4611,7 @@
                 <w:noProof/>
                 <w:webHidden/>
               </w:rPr>
-              <w:t>61</w:t>
+              <w:t>60</w:t>
             </w:r>
             <w:r>
               <w:rPr>
@@ -4638,7 +4636,7 @@
               <w:lang w:val="es-PE" w:eastAsia="es-PE"/>
             </w:rPr>
           </w:pPr>
-          <w:hyperlink w:anchor="_Toc243500581" w:history="1">
+          <w:hyperlink w:anchor="_Toc243515285" w:history="1">
             <w:r>
               <w:rPr>
                 <w:rStyle w:val="Hipervnculo"/>
@@ -4665,7 +4663,7 @@
                 <w:noProof/>
                 <w:webHidden/>
               </w:rPr>
-              <w:instrText xml:space="preserve"> PAGEREF _Toc243500581 \h </w:instrText>
+              <w:instrText xml:space="preserve"> PAGEREF _Toc243515285 \h </w:instrText>
             </w:r>
             <w:r>
               <w:rPr>
@@ -4685,7 +4683,7 @@
                 <w:noProof/>
                 <w:webHidden/>
               </w:rPr>
-              <w:t>62</w:t>
+              <w:t>61</w:t>
             </w:r>
             <w:r>
               <w:rPr>
@@ -4710,11 +4708,12 @@
               <w:lang w:val="es-PE" w:eastAsia="es-PE"/>
             </w:rPr>
           </w:pPr>
-          <w:hyperlink w:anchor="_Toc243500582" w:history="1">
+          <w:hyperlink w:anchor="_Toc243515286" w:history="1">
             <w:r>
               <w:rPr>
                 <w:rStyle w:val="Hipervnculo"/>
                 <w:noProof/>
+                <w:lang w:val="es-PE"/>
               </w:rPr>
               <w:t>6.5 Análisis e interpretación técnica</w:t>
             </w:r>
@@ -4737,7 +4736,7 @@
                 <w:noProof/>
                 <w:webHidden/>
               </w:rPr>
-              <w:instrText xml:space="preserve"> PAGEREF _Toc243500582 \h </w:instrText>
+              <w:instrText xml:space="preserve"> PAGEREF _Toc243515286 \h </w:instrText>
             </w:r>
             <w:r>
               <w:rPr>
@@ -4757,7 +4756,7 @@
                 <w:noProof/>
                 <w:webHidden/>
               </w:rPr>
-              <w:t>64</w:t>
+              <w:t>63</w:t>
             </w:r>
             <w:r>
               <w:rPr>
@@ -4782,11 +4781,12 @@
               <w:lang w:val="es-PE" w:eastAsia="es-PE"/>
             </w:rPr>
           </w:pPr>
-          <w:hyperlink w:anchor="_Toc243500583" w:history="1">
+          <w:hyperlink w:anchor="_Toc243515287" w:history="1">
             <w:r>
               <w:rPr>
                 <w:rStyle w:val="Hipervnculo"/>
                 <w:noProof/>
+                <w:lang w:val="es-PE"/>
               </w:rPr>
               <w:t>6.6 Verificación de funcionalidad y completitud</w:t>
             </w:r>
@@ -4809,7 +4809,7 @@
                 <w:noProof/>
                 <w:webHidden/>
               </w:rPr>
-              <w:instrText xml:space="preserve"> PAGEREF _Toc243500583 \h </w:instrText>
+              <w:instrText xml:space="preserve"> PAGEREF _Toc243515287 \h </w:instrText>
             </w:r>
             <w:r>
               <w:rPr>
@@ -4829,7 +4829,7 @@
                 <w:noProof/>
                 <w:webHidden/>
               </w:rPr>
-              <w:t>65</w:t>
+              <w:t>66</w:t>
             </w:r>
             <w:r>
               <w:rPr>
@@ -4851,7 +4851,7 @@
               <w:lang w:val="es-PE" w:eastAsia="es-PE"/>
             </w:rPr>
           </w:pPr>
-          <w:hyperlink w:anchor="_Toc243500584" w:history="1">
+          <w:hyperlink w:anchor="_Toc243515288" w:history="1">
             <w:r>
               <w:rPr>
                 <w:rStyle w:val="Hipervnculo"/>
@@ -4879,7 +4879,7 @@
                 <w:noProof/>
                 <w:webHidden/>
               </w:rPr>
-              <w:instrText xml:space="preserve"> PAGEREF _Toc243500584 \h </w:instrText>
+              <w:instrText xml:space="preserve"> PAGEREF _Toc243515288 \h </w:instrText>
             </w:r>
             <w:r>
               <w:rPr>
@@ -4899,7 +4899,7 @@
                 <w:noProof/>
                 <w:webHidden/>
               </w:rPr>
-              <w:t>66</w:t>
+              <w:t>67</w:t>
             </w:r>
             <w:r>
               <w:rPr>
@@ -4924,7 +4924,7 @@
               <w:lang w:val="es-PE" w:eastAsia="es-PE"/>
             </w:rPr>
           </w:pPr>
-          <w:hyperlink w:anchor="_Toc243500585" w:history="1">
+          <w:hyperlink w:anchor="_Toc243515289" w:history="1">
             <w:r>
               <w:rPr>
                 <w:rStyle w:val="Hipervnculo"/>
@@ -4952,7 +4952,7 @@
                 <w:noProof/>
                 <w:webHidden/>
               </w:rPr>
-              <w:instrText xml:space="preserve"> PAGEREF _Toc243500585 \h </w:instrText>
+              <w:instrText xml:space="preserve"> PAGEREF _Toc243515289 \h </w:instrText>
             </w:r>
             <w:r>
               <w:rPr>
@@ -4972,7 +4972,7 @@
                 <w:noProof/>
                 <w:webHidden/>
               </w:rPr>
-              <w:t>66</w:t>
+              <w:t>67</w:t>
             </w:r>
             <w:r>
               <w:rPr>
@@ -4997,7 +4997,7 @@
               <w:lang w:val="es-PE" w:eastAsia="es-PE"/>
             </w:rPr>
           </w:pPr>
-          <w:hyperlink w:anchor="_Toc243500586" w:history="1">
+          <w:hyperlink w:anchor="_Toc243515290" w:history="1">
             <w:r>
               <w:rPr>
                 <w:rStyle w:val="Hipervnculo"/>
@@ -5024,7 +5024,7 @@
                 <w:noProof/>
                 <w:webHidden/>
               </w:rPr>
-              <w:instrText xml:space="preserve"> PAGEREF _Toc243500586 \h </w:instrText>
+              <w:instrText xml:space="preserve"> PAGEREF _Toc243515290 \h </w:instrText>
             </w:r>
             <w:r>
               <w:rPr>
@@ -5044,7 +5044,7 @@
                 <w:noProof/>
                 <w:webHidden/>
               </w:rPr>
-              <w:t>67</w:t>
+              <w:t>68</w:t>
             </w:r>
             <w:r>
               <w:rPr>
@@ -5069,7 +5069,7 @@
               <w:lang w:val="es-PE" w:eastAsia="es-PE"/>
             </w:rPr>
           </w:pPr>
-          <w:hyperlink w:anchor="_Toc243500587" w:history="1">
+          <w:hyperlink w:anchor="_Toc243515291" w:history="1">
             <w:r>
               <w:rPr>
                 <w:rStyle w:val="Hipervnculo"/>
@@ -5097,7 +5097,7 @@
                 <w:noProof/>
                 <w:webHidden/>
               </w:rPr>
-              <w:instrText xml:space="preserve"> PAGEREF _Toc243500587 \h </w:instrText>
+              <w:instrText xml:space="preserve"> PAGEREF _Toc243515291 \h </w:instrText>
             </w:r>
             <w:r>
               <w:rPr>
@@ -5117,7 +5117,7 @@
                 <w:noProof/>
                 <w:webHidden/>
               </w:rPr>
-              <w:t>68</w:t>
+              <w:t>69</w:t>
             </w:r>
             <w:r>
               <w:rPr>
@@ -5139,7 +5139,7 @@
               <w:lang w:val="es-PE" w:eastAsia="es-PE"/>
             </w:rPr>
           </w:pPr>
-          <w:hyperlink w:anchor="_Toc243500588" w:history="1">
+          <w:hyperlink w:anchor="_Toc243515292" w:history="1">
             <w:r>
               <w:rPr>
                 <w:rStyle w:val="Hipervnculo"/>
@@ -5167,7 +5167,7 @@
                 <w:noProof/>
                 <w:webHidden/>
               </w:rPr>
-              <w:instrText xml:space="preserve"> PAGEREF _Toc243500588 \h </w:instrText>
+              <w:instrText xml:space="preserve"> PAGEREF _Toc243515292 \h </w:instrText>
             </w:r>
             <w:r>
               <w:rPr>
@@ -5187,7 +5187,7 @@
                 <w:noProof/>
                 <w:webHidden/>
               </w:rPr>
-              <w:t>69</w:t>
+              <w:t>70</w:t>
             </w:r>
             <w:r>
               <w:rPr>
@@ -5212,7 +5212,7 @@
               <w:lang w:val="es-PE" w:eastAsia="es-PE"/>
             </w:rPr>
           </w:pPr>
-          <w:hyperlink w:anchor="_Toc243500589" w:history="1">
+          <w:hyperlink w:anchor="_Toc243515293" w:history="1">
             <w:r>
               <w:rPr>
                 <w:rStyle w:val="Hipervnculo"/>
@@ -5240,7 +5240,7 @@
                 <w:noProof/>
                 <w:webHidden/>
               </w:rPr>
-              <w:instrText xml:space="preserve"> PAGEREF _Toc243500589 \h </w:instrText>
+              <w:instrText xml:space="preserve"> PAGEREF _Toc243515293 \h </w:instrText>
             </w:r>
             <w:r>
               <w:rPr>
@@ -5260,7 +5260,7 @@
                 <w:noProof/>
                 <w:webHidden/>
               </w:rPr>
-              <w:t>69</w:t>
+              <w:t>70</w:t>
             </w:r>
             <w:r>
               <w:rPr>
@@ -5285,7 +5285,7 @@
               <w:lang w:val="es-PE" w:eastAsia="es-PE"/>
             </w:rPr>
           </w:pPr>
-          <w:hyperlink w:anchor="_Toc243500590" w:history="1">
+          <w:hyperlink w:anchor="_Toc243515294" w:history="1">
             <w:r>
               <w:rPr>
                 <w:rStyle w:val="Hipervnculo"/>
@@ -5313,7 +5313,7 @@
                 <w:noProof/>
                 <w:webHidden/>
               </w:rPr>
-              <w:instrText xml:space="preserve"> PAGEREF _Toc243500590 \h </w:instrText>
+              <w:instrText xml:space="preserve"> PAGEREF _Toc243515294 \h </w:instrText>
             </w:r>
             <w:r>
               <w:rPr>
@@ -5333,7 +5333,7 @@
                 <w:noProof/>
                 <w:webHidden/>
               </w:rPr>
-              <w:t>70</w:t>
+              <w:t>71</w:t>
             </w:r>
             <w:r>
               <w:rPr>
@@ -5358,7 +5358,7 @@
               <w:lang w:val="es-PE" w:eastAsia="es-PE"/>
             </w:rPr>
           </w:pPr>
-          <w:hyperlink w:anchor="_Toc243500591" w:history="1">
+          <w:hyperlink w:anchor="_Toc243515295" w:history="1">
             <w:r>
               <w:rPr>
                 <w:rStyle w:val="Hipervnculo"/>
@@ -5386,7 +5386,7 @@
                 <w:noProof/>
                 <w:webHidden/>
               </w:rPr>
-              <w:instrText xml:space="preserve"> PAGEREF _Toc243500591 \h </w:instrText>
+              <w:instrText xml:space="preserve"> PAGEREF _Toc243515295 \h </w:instrText>
             </w:r>
             <w:r>
               <w:rPr>
@@ -5406,7 +5406,7 @@
                 <w:noProof/>
                 <w:webHidden/>
               </w:rPr>
-              <w:t>70</w:t>
+              <w:t>71</w:t>
             </w:r>
             <w:r>
               <w:rPr>
@@ -5428,12 +5428,11 @@
               <w:lang w:val="es-PE" w:eastAsia="es-PE"/>
             </w:rPr>
           </w:pPr>
-          <w:hyperlink w:anchor="_Toc243500592" w:history="1">
+          <w:hyperlink w:anchor="_Toc243515296" w:history="1">
             <w:r>
               <w:rPr>
                 <w:rStyle w:val="Hipervnculo"/>
                 <w:noProof/>
-                <w:lang w:val="es-PE"/>
               </w:rPr>
               <w:t>REFERENCIAS BIBLIOGRÁFICAS</w:t>
             </w:r>
@@ -5456,7 +5455,7 @@
                 <w:noProof/>
                 <w:webHidden/>
               </w:rPr>
-              <w:instrText xml:space="preserve"> PAGEREF _Toc243500592 \h </w:instrText>
+              <w:instrText xml:space="preserve"> PAGEREF _Toc243515296 \h </w:instrText>
             </w:r>
             <w:r>
               <w:rPr>
@@ -5476,7 +5475,7 @@
                 <w:noProof/>
                 <w:webHidden/>
               </w:rPr>
-              <w:t>71</w:t>
+              <w:t>72</w:t>
             </w:r>
             <w:r>
               <w:rPr>
@@ -5498,7 +5497,7 @@
               <w:lang w:val="es-PE" w:eastAsia="es-PE"/>
             </w:rPr>
           </w:pPr>
-          <w:hyperlink w:anchor="_Toc243500593" w:history="1">
+          <w:hyperlink w:anchor="_Toc243515297" w:history="1">
             <w:r>
               <w:rPr>
                 <w:rStyle w:val="Hipervnculo"/>
@@ -5526,7 +5525,7 @@
                 <w:noProof/>
                 <w:webHidden/>
               </w:rPr>
-              <w:instrText xml:space="preserve"> PAGEREF _Toc243500593 \h </w:instrText>
+              <w:instrText xml:space="preserve"> PAGEREF _Toc243515297 \h </w:instrText>
             </w:r>
             <w:r>
               <w:rPr>
@@ -5546,7 +5545,7 @@
                 <w:noProof/>
                 <w:webHidden/>
               </w:rPr>
-              <w:t>72</w:t>
+              <w:t>73</w:t>
             </w:r>
             <w:r>
               <w:rPr>
@@ -5577,7 +5576,7 @@
           <w:lang w:val="es-PE"/>
         </w:rPr>
       </w:pPr>
-      <w:bookmarkStart w:id="0" w:name="_Toc243500530"/>
+      <w:bookmarkStart w:id="0" w:name="_Toc243515234"/>
       <w:r>
         <w:rPr>
           <w:lang w:val="es-PE"/>
@@ -5654,7 +5653,7 @@
           <w:lang w:val="es-PE"/>
         </w:rPr>
       </w:pPr>
-      <w:bookmarkStart w:id="1" w:name="_Toc243500531"/>
+      <w:bookmarkStart w:id="1" w:name="_Toc243515235"/>
       <w:r>
         <w:rPr>
           <w:lang w:val="es-PE"/>
@@ -5711,7 +5710,7 @@
           <w:lang w:val="es-PE"/>
         </w:rPr>
       </w:pPr>
-      <w:bookmarkStart w:id="2" w:name="_Toc243500532"/>
+      <w:bookmarkStart w:id="2" w:name="_Toc243515236"/>
       <w:r>
         <w:rPr>
           <w:lang w:val="es-PE"/>
@@ -5728,7 +5727,7 @@
           <w:lang w:val="es-PE"/>
         </w:rPr>
       </w:pPr>
-      <w:bookmarkStart w:id="3" w:name="_Toc243500533"/>
+      <w:bookmarkStart w:id="3" w:name="_Toc243515237"/>
       <w:r>
         <w:rPr>
           <w:lang w:val="es-PE"/>
@@ -5807,7 +5806,7 @@
           <w:lang w:val="es-PE"/>
         </w:rPr>
       </w:pPr>
-      <w:bookmarkStart w:id="4" w:name="_Toc243500534"/>
+      <w:bookmarkStart w:id="4" w:name="_Toc243515238"/>
       <w:r>
         <w:rPr>
           <w:lang w:val="es-PE"/>
@@ -5879,7 +5878,7 @@
           <w:lang w:val="es-PE"/>
         </w:rPr>
       </w:pPr>
-      <w:bookmarkStart w:id="5" w:name="_Toc243500535"/>
+      <w:bookmarkStart w:id="5" w:name="_Toc243515239"/>
       <w:r>
         <w:rPr>
           <w:lang w:val="es-PE"/>
@@ -6004,7 +6003,7 @@
           <w:lang w:val="es-PE"/>
         </w:rPr>
       </w:pPr>
-      <w:bookmarkStart w:id="6" w:name="_Toc243500536"/>
+      <w:bookmarkStart w:id="6" w:name="_Toc243515240"/>
       <w:r>
         <w:rPr>
           <w:lang w:val="es-PE"/>
@@ -6096,7 +6095,7 @@
       <w:pPr>
         <w:pStyle w:val="Estilo2APA"/>
       </w:pPr>
-      <w:bookmarkStart w:id="7" w:name="_Toc243500537"/>
+      <w:bookmarkStart w:id="7" w:name="_Toc243515241"/>
       <w:r>
         <w:t>1.5 Stakeholders y criterios de éxito</w:t>
       </w:r>
@@ -6589,7 +6588,7 @@
           <w:lang w:val="es-PE"/>
         </w:rPr>
       </w:pPr>
-      <w:bookmarkStart w:id="8" w:name="_Toc243500538"/>
+      <w:bookmarkStart w:id="8" w:name="_Toc243515242"/>
       <w:r>
         <w:rPr>
           <w:lang w:val="es-PE"/>
@@ -6654,7 +6653,7 @@
           <w:lang w:val="es-PE"/>
         </w:rPr>
       </w:pPr>
-      <w:bookmarkStart w:id="9" w:name="_Toc243500539"/>
+      <w:bookmarkStart w:id="9" w:name="_Toc243515243"/>
       <w:r>
         <w:rPr>
           <w:lang w:val="es-PE"/>
@@ -6670,7 +6669,7 @@
           <w:lang w:val="es-PE"/>
         </w:rPr>
       </w:pPr>
-      <w:bookmarkStart w:id="10" w:name="_Toc243500540"/>
+      <w:bookmarkStart w:id="10" w:name="_Toc243515244"/>
       <w:r>
         <w:rPr>
           <w:lang w:val="es-PE"/>
@@ -6764,7 +6763,7 @@
           <w:lang w:val="es-PE"/>
         </w:rPr>
       </w:pPr>
-      <w:bookmarkStart w:id="11" w:name="_Toc243500541"/>
+      <w:bookmarkStart w:id="11" w:name="_Toc243515245"/>
       <w:r>
         <w:rPr>
           <w:lang w:val="es-PE"/>
@@ -6842,7 +6841,7 @@
           <w:lang w:val="es-PE"/>
         </w:rPr>
       </w:pPr>
-      <w:bookmarkStart w:id="12" w:name="_Toc243500542"/>
+      <w:bookmarkStart w:id="12" w:name="_Toc243515246"/>
       <w:r>
         <w:rPr>
           <w:lang w:val="es-PE"/>
@@ -6977,7 +6976,7 @@
           <w:lang w:val="es-PE"/>
         </w:rPr>
       </w:pPr>
-      <w:bookmarkStart w:id="13" w:name="_Toc243500543"/>
+      <w:bookmarkStart w:id="13" w:name="_Toc243515247"/>
       <w:r>
         <w:rPr>
           <w:lang w:val="es-PE"/>
@@ -7042,7 +7041,7 @@
           <w:lang w:val="es-PE"/>
         </w:rPr>
       </w:pPr>
-      <w:bookmarkStart w:id="14" w:name="_Toc243500544"/>
+      <w:bookmarkStart w:id="14" w:name="_Toc243515248"/>
       <w:r>
         <w:rPr>
           <w:lang w:val="es-PE"/>
@@ -7058,7 +7057,7 @@
           <w:lang w:val="es-PE"/>
         </w:rPr>
       </w:pPr>
-      <w:bookmarkStart w:id="15" w:name="_Toc243500545"/>
+      <w:bookmarkStart w:id="15" w:name="_Toc243515249"/>
       <w:r>
         <w:rPr>
           <w:lang w:val="es-PE"/>
@@ -7271,7 +7270,6 @@
               <w:jc w:val="both"/>
             </w:pPr>
             <w:r>
-              <w:lastRenderedPageBreak/>
               <w:t>RF-BI-04</w:t>
             </w:r>
           </w:p>
@@ -7816,7 +7814,6 @@
               <w:jc w:val="both"/>
             </w:pPr>
             <w:r>
-              <w:lastRenderedPageBreak/>
               <w:t>RNF-07</w:t>
             </w:r>
           </w:p>
@@ -7914,7 +7911,7 @@
           <w:lang w:val="es-PE"/>
         </w:rPr>
       </w:pPr>
-      <w:bookmarkStart w:id="16" w:name="_Toc243500546"/>
+      <w:bookmarkStart w:id="16" w:name="_Toc243515250"/>
       <w:r>
         <w:rPr>
           <w:lang w:val="es-PE"/>
@@ -8530,7 +8527,7 @@
           <w:lang w:val="es-PE"/>
         </w:rPr>
       </w:pPr>
-      <w:bookmarkStart w:id="17" w:name="_Toc243500547"/>
+      <w:bookmarkStart w:id="17" w:name="_Toc243515251"/>
       <w:r>
         <w:rPr>
           <w:lang w:val="es-PE"/>
@@ -9228,7 +9225,7 @@
           <w:lang w:val="es-PE"/>
         </w:rPr>
       </w:pPr>
-      <w:bookmarkStart w:id="18" w:name="_Toc243500548"/>
+      <w:bookmarkStart w:id="18" w:name="_Toc243515252"/>
       <w:r>
         <w:rPr>
           <w:lang w:val="es-PE"/>
@@ -9245,7 +9242,7 @@
           <w:lang w:val="es-PE"/>
         </w:rPr>
       </w:pPr>
-      <w:bookmarkStart w:id="19" w:name="_Toc243500549"/>
+      <w:bookmarkStart w:id="19" w:name="_Toc243515253"/>
       <w:r>
         <w:rPr>
           <w:lang w:val="es-PE"/>
@@ -9665,7 +9662,6 @@
               <w:rPr>
                 <w:rFonts w:ascii="Times New Roman" w:hAnsi="Times New Roman" w:cs="Times New Roman"/>
               </w:rPr>
-              <w:lastRenderedPageBreak/>
               <w:t>K2</w:t>
             </w:r>
           </w:p>
@@ -10334,7 +10330,6 @@
               <w:rPr>
                 <w:rFonts w:ascii="Times New Roman" w:hAnsi="Times New Roman" w:cs="Times New Roman"/>
               </w:rPr>
-              <w:lastRenderedPageBreak/>
               <w:t>K6</w:t>
             </w:r>
           </w:p>
@@ -10988,7 +10983,6 @@
                 <w:rFonts w:ascii="Times New Roman" w:hAnsi="Times New Roman"/>
                 <w:color w:val="000000"/>
               </w:rPr>
-              <w:lastRenderedPageBreak/>
               <w:t>K10</w:t>
             </w:r>
           </w:p>
@@ -11156,7 +11150,6 @@
           <w:color w:val="000000"/>
           <w:lang w:val="es-PE"/>
         </w:rPr>
-        <w:lastRenderedPageBreak/>
         <w:t xml:space="preserve">Línea base calculada el 09/10/2026 sobre </w:t>
       </w:r>
       <w:proofErr w:type="spellStart"/>
@@ -11203,7 +11196,7 @@
           <w:lang w:val="es-PE"/>
         </w:rPr>
       </w:pPr>
-      <w:bookmarkStart w:id="20" w:name="_Toc243500550"/>
+      <w:bookmarkStart w:id="20" w:name="_Toc243515254"/>
       <w:r>
         <w:rPr>
           <w:lang w:val="es-PE"/>
@@ -12770,7 +12763,7 @@
           <w:lang w:val="es-PE"/>
         </w:rPr>
       </w:pPr>
-      <w:bookmarkStart w:id="21" w:name="_Toc243500551"/>
+      <w:bookmarkStart w:id="21" w:name="_Toc243515255"/>
       <w:r>
         <w:rPr>
           <w:lang w:val="es-PE"/>
@@ -13259,7 +13252,6 @@
               <w:rPr>
                 <w:rFonts w:ascii="Times New Roman" w:hAnsi="Times New Roman" w:cs="Times New Roman"/>
               </w:rPr>
-              <w:lastRenderedPageBreak/>
               <w:t>4. Carga de hechos</w:t>
             </w:r>
           </w:p>
@@ -13917,7 +13909,6 @@
               <w:rPr>
                 <w:rFonts w:ascii="Times New Roman" w:hAnsi="Times New Roman" w:cs="Times New Roman"/>
               </w:rPr>
-              <w:lastRenderedPageBreak/>
               <w:t>R05</w:t>
             </w:r>
           </w:p>
@@ -14382,7 +14373,6 @@
               <w:rPr>
                 <w:rFonts w:ascii="Times New Roman" w:hAnsi="Times New Roman"/>
               </w:rPr>
-              <w:lastRenderedPageBreak/>
               <w:t>R04</w:t>
             </w:r>
           </w:p>
@@ -14605,7 +14595,7 @@
           <w:lang w:val="es-PE"/>
         </w:rPr>
       </w:pPr>
-      <w:bookmarkStart w:id="22" w:name="_Toc243500552"/>
+      <w:bookmarkStart w:id="22" w:name="_Toc243515256"/>
       <w:r>
         <w:rPr>
           <w:lang w:val="es-PE"/>
@@ -14782,7 +14772,7 @@
           <w:lang w:val="es-PE"/>
         </w:rPr>
       </w:pPr>
-      <w:bookmarkStart w:id="23" w:name="_Toc243500553"/>
+      <w:bookmarkStart w:id="23" w:name="_Toc243515257"/>
       <w:r>
         <w:rPr>
           <w:lang w:val="es-PE"/>
@@ -14819,7 +14809,7 @@
           <w:lang w:val="es-PE"/>
         </w:rPr>
       </w:pPr>
-      <w:bookmarkStart w:id="24" w:name="_Toc243500554"/>
+      <w:bookmarkStart w:id="24" w:name="_Toc243515258"/>
       <w:r>
         <w:rPr>
           <w:lang w:val="es-PE"/>
@@ -14854,7 +14844,7 @@
           <w:lang w:val="es-PE"/>
         </w:rPr>
       </w:pPr>
-      <w:bookmarkStart w:id="25" w:name="_Toc243500555"/>
+      <w:bookmarkStart w:id="25" w:name="_Toc243515259"/>
       <w:r>
         <w:rPr>
           <w:lang w:val="es-PE"/>
@@ -14889,7 +14879,7 @@
           <w:lang w:val="es-PE"/>
         </w:rPr>
       </w:pPr>
-      <w:bookmarkStart w:id="26" w:name="_Toc243500556"/>
+      <w:bookmarkStart w:id="26" w:name="_Toc243515260"/>
       <w:r>
         <w:rPr>
           <w:lang w:val="es-PE"/>
@@ -14924,7 +14914,7 @@
           <w:lang w:val="es-PE"/>
         </w:rPr>
       </w:pPr>
-      <w:bookmarkStart w:id="27" w:name="_Toc243500557"/>
+      <w:bookmarkStart w:id="27" w:name="_Toc243515261"/>
       <w:r>
         <w:rPr>
           <w:lang w:val="es-PE"/>
@@ -14962,7 +14952,7 @@
           <w:lang w:val="es-PE"/>
         </w:rPr>
       </w:pPr>
-      <w:bookmarkStart w:id="28" w:name="_Toc243500558"/>
+      <w:bookmarkStart w:id="28" w:name="_Toc243515262"/>
       <w:r>
         <w:rPr>
           <w:lang w:val="es-PE"/>
@@ -15006,7 +14996,7 @@
           <w:lang w:val="es-PE"/>
         </w:rPr>
       </w:pPr>
-      <w:bookmarkStart w:id="29" w:name="_Toc243500559"/>
+      <w:bookmarkStart w:id="29" w:name="_Toc243515263"/>
       <w:r>
         <w:rPr>
           <w:lang w:val="es-PE"/>
@@ -15706,7 +15696,6 @@
           <w:i/>
           <w:iCs/>
         </w:rPr>
-        <w:lastRenderedPageBreak/>
         <w:t>Tabla</w:t>
       </w:r>
       <w:proofErr w:type="spellEnd"/>
@@ -16083,7 +16072,7 @@
           <w:lang w:val="es-PE"/>
         </w:rPr>
       </w:pPr>
-      <w:bookmarkStart w:id="30" w:name="_Toc243500560"/>
+      <w:bookmarkStart w:id="30" w:name="_Toc243515264"/>
       <w:r>
         <w:rPr>
           <w:lang w:val="es-PE"/>
@@ -16358,7 +16347,7 @@
           <w:lang w:val="es-PE"/>
         </w:rPr>
       </w:pPr>
-      <w:bookmarkStart w:id="31" w:name="_Toc243500561"/>
+      <w:bookmarkStart w:id="31" w:name="_Toc243515265"/>
       <w:r>
         <w:rPr>
           <w:lang w:val="es-PE"/>
@@ -16374,7 +16363,7 @@
           <w:lang w:val="es-PE"/>
         </w:rPr>
       </w:pPr>
-      <w:bookmarkStart w:id="32" w:name="_Toc243500562"/>
+      <w:bookmarkStart w:id="32" w:name="_Toc243515266"/>
       <w:r>
         <w:rPr>
           <w:lang w:val="es-PE"/>
@@ -16478,7 +16467,7 @@
       <w:pPr>
         <w:pStyle w:val="Estilo2APA"/>
       </w:pPr>
-      <w:bookmarkStart w:id="33" w:name="_Toc243500563"/>
+      <w:bookmarkStart w:id="33" w:name="_Toc243515267"/>
       <w:r>
         <w:t>4.2 Escenario y datasets</w:t>
       </w:r>
@@ -17175,7 +17164,7 @@
           <w:lang w:val="es-PE"/>
         </w:rPr>
       </w:pPr>
-      <w:bookmarkStart w:id="34" w:name="_Toc243500564"/>
+      <w:bookmarkStart w:id="34" w:name="_Toc243515268"/>
       <w:r>
         <w:rPr>
           <w:lang w:val="es-PE"/>
@@ -18078,7 +18067,7 @@
       <w:pPr>
         <w:pStyle w:val="Estilo2APA"/>
       </w:pPr>
-      <w:bookmarkStart w:id="35" w:name="_Toc243500565"/>
+      <w:bookmarkStart w:id="35" w:name="_Toc243515269"/>
       <w:r>
         <w:t>4.4 Entorno, herramientas y reproducibilidad</w:t>
       </w:r>
@@ -18735,7 +18724,7 @@
       <w:pPr>
         <w:pStyle w:val="Estilo2APA"/>
       </w:pPr>
-      <w:bookmarkStart w:id="36" w:name="_Toc243500566"/>
+      <w:bookmarkStart w:id="36" w:name="_Toc243515270"/>
       <w:r>
         <w:t>4.5 Matriz de escenarios experimentales</w:t>
       </w:r>
@@ -19554,7 +19543,7 @@
       <w:pPr>
         <w:pStyle w:val="Estilo2APA"/>
       </w:pPr>
-      <w:bookmarkStart w:id="37" w:name="_Toc243500567"/>
+      <w:bookmarkStart w:id="37" w:name="_Toc243515271"/>
       <w:r>
         <w:t>4.6 Procedimiento reproducible</w:t>
       </w:r>
@@ -19693,7 +19682,7 @@
           <w:lang w:val="es-PE"/>
         </w:rPr>
       </w:pPr>
-      <w:bookmarkStart w:id="38" w:name="_Toc243500568"/>
+      <w:bookmarkStart w:id="38" w:name="_Toc243515272"/>
       <w:r>
         <w:rPr>
           <w:lang w:val="es-PE"/>
@@ -19730,7 +19719,7 @@
           <w:lang w:val="es-PE"/>
         </w:rPr>
       </w:pPr>
-      <w:bookmarkStart w:id="39" w:name="_Toc243500569"/>
+      <w:bookmarkStart w:id="39" w:name="_Toc243515273"/>
       <w:r>
         <w:rPr>
           <w:lang w:val="es-PE"/>
@@ -19746,7 +19735,7 @@
           <w:lang w:val="es-PE"/>
         </w:rPr>
       </w:pPr>
-      <w:bookmarkStart w:id="40" w:name="_Toc243500570"/>
+      <w:bookmarkStart w:id="40" w:name="_Toc243515274"/>
       <w:r>
         <w:rPr>
           <w:lang w:val="es-PE"/>
@@ -19853,7 +19842,7 @@
           <w:lang w:val="es-PE"/>
         </w:rPr>
       </w:pPr>
-      <w:bookmarkStart w:id="41" w:name="_Toc243500571"/>
+      <w:bookmarkStart w:id="41" w:name="_Toc243515275"/>
       <w:r>
         <w:rPr>
           <w:lang w:val="es-PE"/>
@@ -19964,7 +19953,7 @@
           <w:lang w:val="es-PE"/>
         </w:rPr>
       </w:pPr>
-      <w:bookmarkStart w:id="42" w:name="_Toc243500572"/>
+      <w:bookmarkStart w:id="42" w:name="_Toc243515276"/>
       <w:r>
         <w:rPr>
           <w:lang w:val="es-PE"/>
@@ -19999,7 +19988,7 @@
           <w:lang w:val="es-PE"/>
         </w:rPr>
       </w:pPr>
-      <w:bookmarkStart w:id="43" w:name="_Toc243500573"/>
+      <w:bookmarkStart w:id="43" w:name="_Toc243515277"/>
       <w:r>
         <w:rPr>
           <w:lang w:val="es-PE"/>
@@ -20925,7 +20914,7 @@
       <w:pPr>
         <w:pStyle w:val="Estilo2APA"/>
       </w:pPr>
-      <w:bookmarkStart w:id="44" w:name="_Toc243500574"/>
+      <w:bookmarkStart w:id="44" w:name="_Toc243515278"/>
       <w:r>
         <w:lastRenderedPageBreak/>
         <w:t>5.5 Registro de retroalimentación y mejoras</w:t>
@@ -21528,7 +21517,7 @@
       <w:pPr>
         <w:pStyle w:val="Estilo2APA"/>
       </w:pPr>
-      <w:bookmarkStart w:id="45" w:name="_Toc243500575"/>
+      <w:bookmarkStart w:id="45" w:name="_Toc243515279"/>
       <w:r>
         <w:lastRenderedPageBreak/>
         <w:t>5.6 Contribuciones individuales</w:t>
@@ -22530,7 +22519,7 @@
           <w:lang w:val="es-PE"/>
         </w:rPr>
       </w:pPr>
-      <w:bookmarkStart w:id="46" w:name="_Toc243500576"/>
+      <w:bookmarkStart w:id="46" w:name="_Toc243515280"/>
       <w:r>
         <w:rPr>
           <w:lang w:val="es-PE"/>
@@ -23746,7 +23735,7 @@
           <w:lang w:val="es-PE"/>
         </w:rPr>
       </w:pPr>
-      <w:bookmarkStart w:id="47" w:name="_Toc243500577"/>
+      <w:bookmarkStart w:id="47" w:name="_Toc243515281"/>
       <w:r>
         <w:rPr>
           <w:lang w:val="es-PE"/>
@@ -23762,7 +23751,7 @@
           <w:lang w:val="es-PE"/>
         </w:rPr>
       </w:pPr>
-      <w:bookmarkStart w:id="48" w:name="_Toc243500578"/>
+      <w:bookmarkStart w:id="48" w:name="_Toc243515282"/>
       <w:r>
         <w:rPr>
           <w:lang w:val="es-PE"/>
@@ -24650,7 +24639,7 @@
           <w:lang w:val="es-PE"/>
         </w:rPr>
       </w:pPr>
-      <w:bookmarkStart w:id="49" w:name="_Toc243500579"/>
+      <w:bookmarkStart w:id="49" w:name="_Toc243515283"/>
       <w:r>
         <w:rPr>
           <w:lang w:val="es-PE"/>
@@ -25839,7 +25828,7 @@
           <w:lang w:val="es-PE"/>
         </w:rPr>
       </w:pPr>
-      <w:bookmarkStart w:id="50" w:name="_Toc243500580"/>
+      <w:bookmarkStart w:id="50" w:name="_Toc243515284"/>
       <w:r>
         <w:rPr>
           <w:lang w:val="es-PE"/>
@@ -26694,7 +26683,7 @@
       <w:pPr>
         <w:pStyle w:val="Estilo2APA"/>
       </w:pPr>
-      <w:bookmarkStart w:id="51" w:name="_Toc243500581"/>
+      <w:bookmarkStart w:id="51" w:name="_Toc243515285"/>
       <w:r>
         <w:t>6.4 Visualizaciones y dashboards</w:t>
       </w:r>
@@ -27048,7 +27037,7 @@
           <w:lang w:val="es-PE"/>
         </w:rPr>
       </w:pPr>
-      <w:bookmarkStart w:id="52" w:name="_Toc243500582"/>
+      <w:bookmarkStart w:id="52" w:name="_Toc243515286"/>
       <w:r>
         <w:rPr>
           <w:lang w:val="es-PE"/>
@@ -27277,7 +27266,7 @@
           <w:lang w:val="es-PE"/>
         </w:rPr>
       </w:pPr>
-      <w:bookmarkStart w:id="53" w:name="_Toc243500583"/>
+      <w:bookmarkStart w:id="53" w:name="_Toc243515287"/>
       <w:r>
         <w:rPr>
           <w:lang w:val="es-PE"/>
@@ -27875,7 +27864,7 @@
           <w:lang w:val="es-PE"/>
         </w:rPr>
       </w:pPr>
-      <w:bookmarkStart w:id="54" w:name="_Toc243500584"/>
+      <w:bookmarkStart w:id="54" w:name="_Toc243515288"/>
       <w:r>
         <w:rPr>
           <w:lang w:val="es-PE"/>
@@ -27892,7 +27881,7 @@
           <w:lang w:val="es-PE"/>
         </w:rPr>
       </w:pPr>
-      <w:bookmarkStart w:id="55" w:name="_Toc243500585"/>
+      <w:bookmarkStart w:id="55" w:name="_Toc243515289"/>
       <w:r>
         <w:rPr>
           <w:lang w:val="es-PE"/>
@@ -28647,7 +28636,7 @@
       <w:pPr>
         <w:pStyle w:val="Estilo2APA"/>
       </w:pPr>
-      <w:bookmarkStart w:id="56" w:name="_Toc243500586"/>
+      <w:bookmarkStart w:id="56" w:name="_Toc243515290"/>
       <w:r>
         <w:t>7.2 Conclusiones técnicas</w:t>
       </w:r>
@@ -28837,7 +28826,7 @@
           <w:lang w:val="es-PE"/>
         </w:rPr>
       </w:pPr>
-      <w:bookmarkStart w:id="57" w:name="_Toc243500587"/>
+      <w:bookmarkStart w:id="57" w:name="_Toc243515291"/>
       <w:r>
         <w:rPr>
           <w:lang w:val="es-PE"/>
@@ -29062,7 +29051,7 @@
           <w:lang w:val="es-PE"/>
         </w:rPr>
       </w:pPr>
-      <w:bookmarkStart w:id="58" w:name="_Toc243500588"/>
+      <w:bookmarkStart w:id="58" w:name="_Toc243515292"/>
       <w:r>
         <w:rPr>
           <w:lang w:val="es-PE"/>
@@ -29078,7 +29067,7 @@
           <w:lang w:val="es-PE"/>
         </w:rPr>
       </w:pPr>
-      <w:bookmarkStart w:id="59" w:name="_Toc243500589"/>
+      <w:bookmarkStart w:id="59" w:name="_Toc243515293"/>
       <w:r>
         <w:rPr>
           <w:lang w:val="es-PE"/>
@@ -29143,7 +29132,7 @@
           <w:lang w:val="es-PE"/>
         </w:rPr>
       </w:pPr>
-      <w:bookmarkStart w:id="60" w:name="_Toc243500590"/>
+      <w:bookmarkStart w:id="60" w:name="_Toc243515294"/>
       <w:r>
         <w:rPr>
           <w:lang w:val="es-PE"/>
@@ -29173,7 +29162,7 @@
           <w:lang w:val="es-PE"/>
         </w:rPr>
       </w:pPr>
-      <w:bookmarkStart w:id="61" w:name="_Toc243500591"/>
+      <w:bookmarkStart w:id="61" w:name="_Toc243515295"/>
       <w:r>
         <w:rPr>
           <w:lang w:val="es-PE"/>
@@ -29209,7 +29198,7 @@
       <w:pPr>
         <w:pStyle w:val="Titulo1APA"/>
       </w:pPr>
-      <w:bookmarkStart w:id="62" w:name="_Toc243500592"/>
+      <w:bookmarkStart w:id="62" w:name="_Toc243515296"/>
       <w:r>
         <w:t>REFERENCIAS BIBLIOGRÁFICAS</w:t>
       </w:r>
@@ -29325,7 +29314,7 @@
           <w:lang w:val="es-PE"/>
         </w:rPr>
       </w:pPr>
-      <w:bookmarkStart w:id="63" w:name="_Toc243500593"/>
+      <w:bookmarkStart w:id="63" w:name="_Toc243515297"/>
       <w:r>
         <w:rPr>
           <w:lang w:val="es-PE"/>
@@ -32525,6 +32514,26 @@
         <w:t>, no ingresé datos personales o sensibles en herramientas externas de IA y asumo la responsabilidad por el trabajo presentado.</w:t>
       </w:r>
     </w:p>
+    <w:p>
+      <w:pPr>
+        <w:spacing w:after="80"/>
+        <w:jc w:val="both"/>
+        <w:rPr>
+          <w:rFonts w:ascii="Telegraf" w:hAnsi="Telegraf"/>
+          <w:lang w:val="es-PE"/>
+        </w:rPr>
+      </w:pPr>
+    </w:p>
+    <w:p>
+      <w:pPr>
+        <w:spacing w:after="80"/>
+        <w:jc w:val="both"/>
+        <w:rPr>
+          <w:rFonts w:ascii="Telegraf" w:hAnsi="Telegraf"/>
+          <w:lang w:val="es-PE"/>
+        </w:rPr>
+      </w:pPr>
+    </w:p>
     <w:tbl>
       <w:tblPr>
         <w:tblStyle w:val="Tablaconcuadrcula"/>
@@ -32533,8 +32542,8 @@
         <w:tblLook w:val="04A0" w:firstRow="1" w:lastRow="0" w:firstColumn="1" w:lastColumn="0" w:noHBand="0" w:noVBand="1"/>
       </w:tblPr>
       <w:tblGrid>
-        <w:gridCol w:w="4695"/>
-        <w:gridCol w:w="3799"/>
+        <w:gridCol w:w="4693"/>
+        <w:gridCol w:w="3801"/>
       </w:tblGrid>
       <w:tr>
         <w:trPr>
@@ -32557,6 +32566,7 @@
                 <w:rFonts w:ascii="Telegraf" w:hAnsi="Telegraf"/>
                 <w:b/>
               </w:rPr>
+              <w:lastRenderedPageBreak/>
               <w:t>Nombre(s)</w:t>
             </w:r>
           </w:p>
@@ -32617,6 +32627,54 @@
                 <w:rFonts w:ascii="Telegraf" w:hAnsi="Telegraf"/>
               </w:rPr>
             </w:pPr>
+            <w:r>
+              <w:rPr>
+                <w:rFonts w:ascii="Telegraf" w:hAnsi="Telegraf"/>
+                <w:noProof/>
+                <w14:ligatures w14:val="standardContextual"/>
+              </w:rPr>
+              <w:drawing>
+                <wp:inline distT="0" distB="0" distL="0" distR="0" wp14:anchorId="5CE2374F" wp14:editId="3445942B">
+                  <wp:extent cx="2276475" cy="997698"/>
+                  <wp:effectExtent l="0" t="0" r="0" b="0"/>
+                  <wp:docPr id="1415601929" name="Imagen 6"/>
+                  <wp:cNvGraphicFramePr>
+                    <a:graphicFrameLocks xmlns:a="http://schemas.openxmlformats.org/drawingml/2006/main" noChangeAspect="1"/>
+                  </wp:cNvGraphicFramePr>
+                  <a:graphic xmlns:a="http://schemas.openxmlformats.org/drawingml/2006/main">
+                    <a:graphicData uri="http://schemas.openxmlformats.org/drawingml/2006/picture">
+                      <pic:pic xmlns:pic="http://schemas.openxmlformats.org/drawingml/2006/picture">
+                        <pic:nvPicPr>
+                          <pic:cNvPr id="1415601929" name="Imagen 1415601929"/>
+                          <pic:cNvPicPr/>
+                        </pic:nvPicPr>
+                        <pic:blipFill>
+                          <a:blip r:embed="rId17" cstate="print">
+                            <a:extLst>
+                              <a:ext uri="{28A0092B-C50C-407E-A947-70E740481C1C}">
+                                <a14:useLocalDpi xmlns:a14="http://schemas.microsoft.com/office/drawing/2010/main" val="0"/>
+                              </a:ext>
+                            </a:extLst>
+                          </a:blip>
+                          <a:stretch>
+                            <a:fillRect/>
+                          </a:stretch>
+                        </pic:blipFill>
+                        <pic:spPr>
+                          <a:xfrm>
+                            <a:off x="0" y="0"/>
+                            <a:ext cx="2287330" cy="1002455"/>
+                          </a:xfrm>
+                          <a:prstGeom prst="rect">
+                            <a:avLst/>
+                          </a:prstGeom>
+                        </pic:spPr>
+                      </pic:pic>
+                    </a:graphicData>
+                  </a:graphic>
+                </wp:inline>
+              </w:drawing>
+            </w:r>
           </w:p>
         </w:tc>
       </w:tr>
@@ -32641,7 +32699,6 @@
                 <w:rFonts w:ascii="Telegraf" w:hAnsi="Telegraf"/>
                 <w:b/>
               </w:rPr>
-              <w:lastRenderedPageBreak/>
               <w:t>Fabrizzio Bueno Fernandez</w:t>
             </w:r>
           </w:p>
@@ -32656,6 +32713,57 @@
                 <w:rFonts w:ascii="Telegraf" w:hAnsi="Telegraf"/>
               </w:rPr>
             </w:pPr>
+            <w:r>
+              <w:rPr>
+                <w:rFonts w:ascii="Telegraf" w:hAnsi="Telegraf"/>
+                <w:noProof/>
+              </w:rPr>
+              <w:drawing>
+                <wp:inline distT="0" distB="0" distL="0" distR="0" wp14:anchorId="2DE1814A" wp14:editId="52D79A41">
+                  <wp:extent cx="1418245" cy="983286"/>
+                  <wp:effectExtent l="0" t="0" r="0" b="7620"/>
+                  <wp:docPr id="362831890" name="Imagen 2"/>
+                  <wp:cNvGraphicFramePr>
+                    <a:graphicFrameLocks xmlns:a="http://schemas.openxmlformats.org/drawingml/2006/main" noChangeAspect="1"/>
+                  </wp:cNvGraphicFramePr>
+                  <a:graphic xmlns:a="http://schemas.openxmlformats.org/drawingml/2006/main">
+                    <a:graphicData uri="http://schemas.openxmlformats.org/drawingml/2006/picture">
+                      <pic:pic xmlns:pic="http://schemas.openxmlformats.org/drawingml/2006/picture">
+                        <pic:nvPicPr>
+                          <pic:cNvPr id="0" name="Picture 2"/>
+                          <pic:cNvPicPr>
+                            <a:picLocks noChangeAspect="1" noChangeArrowheads="1"/>
+                          </pic:cNvPicPr>
+                        </pic:nvPicPr>
+                        <pic:blipFill>
+                          <a:blip r:embed="rId18" cstate="print">
+                            <a:extLst>
+                              <a:ext uri="{28A0092B-C50C-407E-A947-70E740481C1C}">
+                                <a14:useLocalDpi xmlns:a14="http://schemas.microsoft.com/office/drawing/2010/main" val="0"/>
+                              </a:ext>
+                            </a:extLst>
+                          </a:blip>
+                          <a:srcRect/>
+                          <a:stretch>
+                            <a:fillRect/>
+                          </a:stretch>
+                        </pic:blipFill>
+                        <pic:spPr bwMode="auto">
+                          <a:xfrm>
+                            <a:off x="0" y="0"/>
+                            <a:ext cx="1435792" cy="995452"/>
+                          </a:xfrm>
+                          <a:prstGeom prst="rect">
+                            <a:avLst/>
+                          </a:prstGeom>
+                          <a:noFill/>
+                        </pic:spPr>
+                      </pic:pic>
+                    </a:graphicData>
+                  </a:graphic>
+                </wp:inline>
+              </w:drawing>
+            </w:r>
           </w:p>
         </w:tc>
       </w:tr>
@@ -32703,6 +32811,57 @@
                 <w:rFonts w:ascii="Telegraf" w:hAnsi="Telegraf"/>
               </w:rPr>
             </w:pPr>
+            <w:r>
+              <w:rPr>
+                <w:rFonts w:ascii="Telegraf" w:hAnsi="Telegraf"/>
+                <w:noProof/>
+              </w:rPr>
+              <w:drawing>
+                <wp:inline distT="0" distB="0" distL="0" distR="0" wp14:anchorId="384C3CDF" wp14:editId="0598D2B2">
+                  <wp:extent cx="1581150" cy="1642842"/>
+                  <wp:effectExtent l="0" t="0" r="0" b="0"/>
+                  <wp:docPr id="1406825476" name="Imagen 5"/>
+                  <wp:cNvGraphicFramePr>
+                    <a:graphicFrameLocks xmlns:a="http://schemas.openxmlformats.org/drawingml/2006/main" noChangeAspect="1"/>
+                  </wp:cNvGraphicFramePr>
+                  <a:graphic xmlns:a="http://schemas.openxmlformats.org/drawingml/2006/main">
+                    <a:graphicData uri="http://schemas.openxmlformats.org/drawingml/2006/picture">
+                      <pic:pic xmlns:pic="http://schemas.openxmlformats.org/drawingml/2006/picture">
+                        <pic:nvPicPr>
+                          <pic:cNvPr id="0" name="Picture 5"/>
+                          <pic:cNvPicPr>
+                            <a:picLocks noChangeAspect="1" noChangeArrowheads="1"/>
+                          </pic:cNvPicPr>
+                        </pic:nvPicPr>
+                        <pic:blipFill>
+                          <a:blip r:embed="rId19" cstate="print">
+                            <a:extLst>
+                              <a:ext uri="{28A0092B-C50C-407E-A947-70E740481C1C}">
+                                <a14:useLocalDpi xmlns:a14="http://schemas.microsoft.com/office/drawing/2010/main" val="0"/>
+                              </a:ext>
+                            </a:extLst>
+                          </a:blip>
+                          <a:srcRect/>
+                          <a:stretch>
+                            <a:fillRect/>
+                          </a:stretch>
+                        </pic:blipFill>
+                        <pic:spPr bwMode="auto">
+                          <a:xfrm>
+                            <a:off x="0" y="0"/>
+                            <a:ext cx="1593818" cy="1656005"/>
+                          </a:xfrm>
+                          <a:prstGeom prst="rect">
+                            <a:avLst/>
+                          </a:prstGeom>
+                          <a:noFill/>
+                        </pic:spPr>
+                      </pic:pic>
+                    </a:graphicData>
+                  </a:graphic>
+                </wp:inline>
+              </w:drawing>
+            </w:r>
           </w:p>
         </w:tc>
       </w:tr>
@@ -32741,6 +32900,57 @@
                 <w:rFonts w:ascii="Telegraf" w:hAnsi="Telegraf"/>
               </w:rPr>
             </w:pPr>
+            <w:r>
+              <w:rPr>
+                <w:rFonts w:ascii="Telegraf" w:hAnsi="Telegraf"/>
+                <w:noProof/>
+              </w:rPr>
+              <w:drawing>
+                <wp:inline distT="0" distB="0" distL="0" distR="0" wp14:anchorId="29ED34DD" wp14:editId="0D836A7C">
+                  <wp:extent cx="1097280" cy="822960"/>
+                  <wp:effectExtent l="0" t="0" r="7620" b="0"/>
+                  <wp:docPr id="884983722" name="Imagen 3"/>
+                  <wp:cNvGraphicFramePr>
+                    <a:graphicFrameLocks xmlns:a="http://schemas.openxmlformats.org/drawingml/2006/main" noChangeAspect="1"/>
+                  </wp:cNvGraphicFramePr>
+                  <a:graphic xmlns:a="http://schemas.openxmlformats.org/drawingml/2006/main">
+                    <a:graphicData uri="http://schemas.openxmlformats.org/drawingml/2006/picture">
+                      <pic:pic xmlns:pic="http://schemas.openxmlformats.org/drawingml/2006/picture">
+                        <pic:nvPicPr>
+                          <pic:cNvPr id="0" name="Picture 3"/>
+                          <pic:cNvPicPr>
+                            <a:picLocks noChangeAspect="1" noChangeArrowheads="1"/>
+                          </pic:cNvPicPr>
+                        </pic:nvPicPr>
+                        <pic:blipFill>
+                          <a:blip r:embed="rId20" cstate="print">
+                            <a:extLst>
+                              <a:ext uri="{28A0092B-C50C-407E-A947-70E740481C1C}">
+                                <a14:useLocalDpi xmlns:a14="http://schemas.microsoft.com/office/drawing/2010/main" val="0"/>
+                              </a:ext>
+                            </a:extLst>
+                          </a:blip>
+                          <a:srcRect/>
+                          <a:stretch>
+                            <a:fillRect/>
+                          </a:stretch>
+                        </pic:blipFill>
+                        <pic:spPr bwMode="auto">
+                          <a:xfrm>
+                            <a:off x="0" y="0"/>
+                            <a:ext cx="1120005" cy="840004"/>
+                          </a:xfrm>
+                          <a:prstGeom prst="rect">
+                            <a:avLst/>
+                          </a:prstGeom>
+                          <a:noFill/>
+                        </pic:spPr>
+                      </pic:pic>
+                    </a:graphicData>
+                  </a:graphic>
+                </wp:inline>
+              </w:drawing>
+            </w:r>
           </w:p>
         </w:tc>
       </w:tr>
@@ -32772,6 +32982,9 @@
         <w:tc>
           <w:tcPr>
             <w:tcW w:w="3799" w:type="dxa"/>
+            <w:tcBorders>
+              <w:bottom w:val="single" w:sz="4" w:space="0" w:color="auto"/>
+            </w:tcBorders>
           </w:tcPr>
           <w:p>
             <w:pPr>
@@ -32779,6 +32992,57 @@
                 <w:rFonts w:ascii="Telegraf" w:hAnsi="Telegraf"/>
               </w:rPr>
             </w:pPr>
+            <w:r>
+              <w:rPr>
+                <w:rFonts w:ascii="Telegraf" w:hAnsi="Telegraf"/>
+                <w:noProof/>
+              </w:rPr>
+              <w:drawing>
+                <wp:inline distT="0" distB="0" distL="0" distR="0" wp14:anchorId="10273E88" wp14:editId="24312C76">
+                  <wp:extent cx="1768312" cy="1109156"/>
+                  <wp:effectExtent l="0" t="0" r="3810" b="0"/>
+                  <wp:docPr id="889578749" name="Imagen 4"/>
+                  <wp:cNvGraphicFramePr>
+                    <a:graphicFrameLocks xmlns:a="http://schemas.openxmlformats.org/drawingml/2006/main" noChangeAspect="1"/>
+                  </wp:cNvGraphicFramePr>
+                  <a:graphic xmlns:a="http://schemas.openxmlformats.org/drawingml/2006/main">
+                    <a:graphicData uri="http://schemas.openxmlformats.org/drawingml/2006/picture">
+                      <pic:pic xmlns:pic="http://schemas.openxmlformats.org/drawingml/2006/picture">
+                        <pic:nvPicPr>
+                          <pic:cNvPr id="0" name="Picture 4"/>
+                          <pic:cNvPicPr>
+                            <a:picLocks noChangeAspect="1" noChangeArrowheads="1"/>
+                          </pic:cNvPicPr>
+                        </pic:nvPicPr>
+                        <pic:blipFill>
+                          <a:blip r:embed="rId21" cstate="print">
+                            <a:extLst>
+                              <a:ext uri="{28A0092B-C50C-407E-A947-70E740481C1C}">
+                                <a14:useLocalDpi xmlns:a14="http://schemas.microsoft.com/office/drawing/2010/main" val="0"/>
+                              </a:ext>
+                            </a:extLst>
+                          </a:blip>
+                          <a:srcRect/>
+                          <a:stretch>
+                            <a:fillRect/>
+                          </a:stretch>
+                        </pic:blipFill>
+                        <pic:spPr bwMode="auto">
+                          <a:xfrm>
+                            <a:off x="0" y="0"/>
+                            <a:ext cx="1825253" cy="1144871"/>
+                          </a:xfrm>
+                          <a:prstGeom prst="rect">
+                            <a:avLst/>
+                          </a:prstGeom>
+                          <a:noFill/>
+                        </pic:spPr>
+                      </pic:pic>
+                    </a:graphicData>
+                  </a:graphic>
+                </wp:inline>
+              </w:drawing>
+            </w:r>
           </w:p>
         </w:tc>
       </w:tr>
@@ -32789,6 +33053,9 @@
         <w:tc>
           <w:tcPr>
             <w:tcW w:w="4695" w:type="dxa"/>
+            <w:tcBorders>
+              <w:right w:val="nil"/>
+            </w:tcBorders>
             <w:vAlign w:val="center"/>
           </w:tcPr>
           <w:p>
@@ -32825,6 +33092,9 @@
         <w:tc>
           <w:tcPr>
             <w:tcW w:w="3799" w:type="dxa"/>
+            <w:tcBorders>
+              <w:left w:val="nil"/>
+            </w:tcBorders>
           </w:tcPr>
           <w:p>
             <w:pPr>
@@ -32971,10 +33241,10 @@
       </w:pPr>
     </w:p>
     <w:sectPr>
-      <w:headerReference w:type="even" r:id="rId17"/>
-      <w:headerReference w:type="default" r:id="rId18"/>
-      <w:footerReference w:type="default" r:id="rId19"/>
-      <w:headerReference w:type="first" r:id="rId20"/>
+      <w:headerReference w:type="even" r:id="rId22"/>
+      <w:headerReference w:type="default" r:id="rId23"/>
+      <w:footerReference w:type="default" r:id="rId24"/>
+      <w:headerReference w:type="first" r:id="rId25"/>
       <w:pgSz w:w="11906" w:h="16838"/>
       <w:pgMar w:top="1417" w:right="1701" w:bottom="1417" w:left="1701" w:header="708" w:footer="708" w:gutter="0"/>
       <w:cols w:space="708"/>
@@ -38067,15 +38337,6 @@
 </file>
 
 <file path=customXml/item1.xml><?xml version="1.0" encoding="utf-8"?>
-<?mso-contentType ?>
-<FormTemplates xmlns="http://schemas.microsoft.com/sharepoint/v3/contenttype/forms">
-  <Display>DocumentLibraryForm</Display>
-  <Edit>DocumentLibraryForm</Edit>
-  <New>DocumentLibraryForm</New>
-</FormTemplates>
-</file>
-
-<file path=customXml/item2.xml><?xml version="1.0" encoding="utf-8"?>
 <p:properties xmlns:p="http://schemas.microsoft.com/office/2006/metadata/properties" xmlns:xsi="http://www.w3.org/2001/XMLSchema-instance" xmlns:pc="http://schemas.microsoft.com/office/infopath/2007/PartnerControls">
   <documentManagement>
     <TaxCatchAll xmlns="2614824b-a320-4373-85ea-73b3da18f163" xsi:nil="true"/>
@@ -38086,11 +38347,16 @@
 </p:properties>
 </file>
 
-<file path=customXml/item3.xml><?xml version="1.0" encoding="utf-8"?>
-<b:Sources xmlns:b="http://schemas.openxmlformats.org/officeDocument/2006/bibliography" xmlns="http://schemas.openxmlformats.org/officeDocument/2006/bibliography" SelectedStyle="\APASixthEditionOfficeOnline.xsl" StyleName="APA" Version="6"/>
+<file path=customXml/item2.xml><?xml version="1.0" encoding="utf-8"?>
+<?mso-contentType ?>
+<FormTemplates xmlns="http://schemas.microsoft.com/sharepoint/v3/contenttype/forms">
+  <Display>DocumentLibraryForm</Display>
+  <Edit>DocumentLibraryForm</Edit>
+  <New>DocumentLibraryForm</New>
+</FormTemplates>
 </file>
 
-<file path=customXml/item4.xml><?xml version="1.0" encoding="utf-8"?>
+<file path=customXml/item3.xml><?xml version="1.0" encoding="utf-8"?>
 <ct:contentTypeSchema xmlns:ct="http://schemas.microsoft.com/office/2006/metadata/contentType" xmlns:ma="http://schemas.microsoft.com/office/2006/metadata/properties/metaAttributes" ct:_="" ma:_="" ma:contentTypeName="Documento" ma:contentTypeID="0x010100B61F8F196ED39C4CA2716856819011E9" ma:contentTypeVersion="11" ma:contentTypeDescription="Crear nuevo documento." ma:contentTypeScope="" ma:versionID="cbd9c1cfa447b1b908507f236217bcc0">
   <xsd:schema xmlns:xsd="http://www.w3.org/2001/XMLSchema" xmlns:xs="http://www.w3.org/2001/XMLSchema" xmlns:p="http://schemas.microsoft.com/office/2006/metadata/properties" xmlns:ns2="79ea598a-8a7a-4bdd-a4c2-f177b5709440" xmlns:ns3="2614824b-a320-4373-85ea-73b3da18f163" targetNamespace="http://schemas.microsoft.com/office/2006/metadata/properties" ma:root="true" ma:fieldsID="0c54825fc1bf2a1a004d0d3ba670269f" ns2:_="" ns3:_="">
     <xsd:import namespace="79ea598a-8a7a-4bdd-a4c2-f177b5709440"/>
@@ -38285,15 +38551,11 @@
 </ct:contentTypeSchema>
 </file>
 
-<file path=customXml/itemProps1.xml><?xml version="1.0" encoding="utf-8"?>
-<ds:datastoreItem xmlns:ds="http://schemas.openxmlformats.org/officeDocument/2006/customXml" ds:itemID="{5462FC43-E482-4149-907F-0D65F1C4AC3A}">
-  <ds:schemaRefs>
-    <ds:schemaRef ds:uri="http://schemas.microsoft.com/sharepoint/v3/contenttype/forms"/>
-  </ds:schemaRefs>
-</ds:datastoreItem>
+<file path=customXml/item4.xml><?xml version="1.0" encoding="utf-8"?>
+<b:Sources xmlns:b="http://schemas.openxmlformats.org/officeDocument/2006/bibliography" xmlns="http://schemas.openxmlformats.org/officeDocument/2006/bibliography" SelectedStyle="\APASixthEditionOfficeOnline.xsl" StyleName="APA" Version="6"/>
 </file>
 
-<file path=customXml/itemProps2.xml><?xml version="1.0" encoding="utf-8"?>
+<file path=customXml/itemProps1.xml><?xml version="1.0" encoding="utf-8"?>
 <ds:datastoreItem xmlns:ds="http://schemas.openxmlformats.org/officeDocument/2006/customXml" ds:itemID="{19815EC6-D65E-4027-823B-7339BEB66178}">
   <ds:schemaRefs>
     <ds:schemaRef ds:uri="http://schemas.microsoft.com/office/2006/metadata/properties"/>
@@ -38304,15 +38566,15 @@
 </ds:datastoreItem>
 </file>
 
-<file path=customXml/itemProps3.xml><?xml version="1.0" encoding="utf-8"?>
-<ds:datastoreItem xmlns:ds="http://schemas.openxmlformats.org/officeDocument/2006/customXml" ds:itemID="{6E29EC09-DF90-4CBC-98BE-5BB5D23D9420}">
+<file path=customXml/itemProps2.xml><?xml version="1.0" encoding="utf-8"?>
+<ds:datastoreItem xmlns:ds="http://schemas.openxmlformats.org/officeDocument/2006/customXml" ds:itemID="{5462FC43-E482-4149-907F-0D65F1C4AC3A}">
   <ds:schemaRefs>
-    <ds:schemaRef ds:uri="http://schemas.openxmlformats.org/officeDocument/2006/bibliography"/>
+    <ds:schemaRef ds:uri="http://schemas.microsoft.com/sharepoint/v3/contenttype/forms"/>
   </ds:schemaRefs>
 </ds:datastoreItem>
 </file>
 
-<file path=customXml/itemProps4.xml><?xml version="1.0" encoding="utf-8"?>
+<file path=customXml/itemProps3.xml><?xml version="1.0" encoding="utf-8"?>
 <ds:datastoreItem xmlns:ds="http://schemas.openxmlformats.org/officeDocument/2006/customXml" ds:itemID="{2C0365A0-1391-4E28-9C98-99548E09DB04}">
   <ds:schemaRefs>
     <ds:schemaRef ds:uri="http://schemas.microsoft.com/office/2006/metadata/contentType"/>
@@ -38329,4 +38591,12 @@
     <ds:schemaRef ds:uri="http://schemas.microsoft.com/internal/obd"/>
   </ds:schemaRefs>
 </ds:datastoreItem>
+</file>
+
+<file path=customXml/itemProps4.xml><?xml version="1.0" encoding="utf-8"?>
+<ds:datastoreItem xmlns:ds="http://schemas.openxmlformats.org/officeDocument/2006/customXml" ds:itemID="{6E29EC09-DF90-4CBC-98BE-5BB5D23D9420}">
+  <ds:schemaRefs>
+    <ds:schemaRef ds:uri="http://schemas.openxmlformats.org/officeDocument/2006/bibliography"/>
+  </ds:schemaRefs>
+</ds:datastoreItem>
 </file>
</xml_diff>